<commit_message>
CNN, RNN and Transformer
</commit_message>
<xml_diff>
--- a/3. 深度学习/1. 神经网络/神经网络概述.docx
+++ b/3. 深度学习/1. 神经网络/神经网络概述.docx
@@ -2,6 +2,135 @@
 <file path=word/document.xml><?xml version="1.0" encoding="utf-8"?>
 <w:document xmlns:wpc="http://schemas.microsoft.com/office/word/2010/wordprocessingCanvas" xmlns:cx="http://schemas.microsoft.com/office/drawing/2014/chartex" xmlns:cx1="http://schemas.microsoft.com/office/drawing/2015/9/8/chartex" xmlns:cx2="http://schemas.microsoft.com/office/drawing/2015/10/21/chartex" xmlns:cx3="http://schemas.microsoft.com/office/drawing/2016/5/9/chartex" xmlns:cx4="http://schemas.microsoft.com/office/drawing/2016/5/10/chartex" xmlns:cx5="http://schemas.microsoft.com/office/drawing/2016/5/11/chartex" xmlns:cx6="http://schemas.microsoft.com/office/drawing/2016/5/12/chartex" xmlns:cx7="http://schemas.microsoft.com/office/drawing/2016/5/13/chartex" xmlns:cx8="http://schemas.microsoft.com/office/drawing/2016/5/14/chartex" xmlns:mc="http://schemas.openxmlformats.org/markup-compatibility/2006" xmlns:aink="http://schemas.microsoft.com/office/drawing/2016/ink" xmlns:am3d="http://schemas.microsoft.com/office/drawing/2017/model3d" xmlns:o="urn:schemas-microsoft-com:office:office" xmlns:oel="http://schemas.microsoft.com/office/2019/extlst" xmlns:r="http://schemas.openxmlformats.org/officeDocument/2006/relationships" xmlns:m="http://schemas.openxmlformats.org/officeDocument/2006/math" xmlns:v="urn:schemas-microsoft-com:vml" xmlns:wp14="http://schemas.microsoft.com/office/word/2010/wordprocessingDrawing" xmlns:wp="http://schemas.openxmlformats.org/drawingml/2006/wordprocessingDrawing" xmlns:w10="urn:schemas-microsoft-com:office:word" xmlns:w="http://schemas.openxmlformats.org/wordprocessingml/2006/main" xmlns:w14="http://schemas.microsoft.com/office/word/2010/wordml" xmlns:w15="http://schemas.microsoft.com/office/word/2012/wordml" xmlns:w16cex="http://schemas.microsoft.com/office/word/2018/wordml/cex" xmlns:w16cid="http://schemas.microsoft.com/office/word/2016/wordml/cid" xmlns:w16="http://schemas.microsoft.com/office/word/2018/wordml" xmlns:w16du="http://schemas.microsoft.com/office/word/2023/wordml/word16du" xmlns:w16sdtdh="http://schemas.microsoft.com/office/word/2020/wordml/sdtdatahash" xmlns:w16sdtfl="http://schemas.microsoft.com/office/word/2024/wordml/sdtformatlock" xmlns:w16se="http://schemas.microsoft.com/office/word/2015/wordml/symex" xmlns:wpg="http://schemas.microsoft.com/office/word/2010/wordprocessingGroup" xmlns:wpi="http://schemas.microsoft.com/office/word/2010/wordprocessingInk" xmlns:wne="http://schemas.microsoft.com/office/word/2006/wordml" xmlns:wps="http://schemas.microsoft.com/office/word/2010/wordprocessingShape" mc:Ignorable="w14 w15 w16se w16cid w16 w16cex w16sdtdh w16sdtfl w16du wp14">
   <w:body>
+    <w:p>
+      <w:pPr>
+        <w:pStyle w:val="1"/>
+      </w:pPr>
+      <w:r>
+        <w:rPr>
+          <w:rFonts w:hint="eastAsia"/>
+        </w:rPr>
+        <w:t>背景</w:t>
+      </w:r>
+    </w:p>
+    <w:p>
+      <w:r>
+        <w:tab/>
+      </w:r>
+      <w:r>
+        <w:rPr>
+          <w:rFonts w:hint="eastAsia"/>
+        </w:rPr>
+        <w:t>传统的机器学习有一个比较明显的短板，只能处理</w:t>
+      </w:r>
+      <w:r>
+        <w:rPr>
+          <w:rFonts w:hint="eastAsia"/>
+          <w:color w:val="EE0000"/>
+        </w:rPr>
+        <w:t>结构化数据</w:t>
+      </w:r>
+      <w:r>
+        <w:rPr>
+          <w:rFonts w:hint="eastAsia"/>
+        </w:rPr>
+        <w:t>。</w:t>
+      </w:r>
+      <w:r>
+        <w:rPr>
+          <w:rFonts w:hint="eastAsia"/>
+        </w:rPr>
+        <w:t>但是，随着音频、视频、文本数据的出现，这个弊端就非常明显了。</w:t>
+      </w:r>
+      <w:r>
+        <w:rPr>
+          <w:rFonts w:hint="eastAsia"/>
+        </w:rPr>
+        <w:t>比如一个猫的图片，全是密密麻麻的像素点，这样就很难提取特征</w:t>
+      </w:r>
+      <w:r>
+        <w:rPr>
+          <w:rFonts w:hint="eastAsia"/>
+        </w:rPr>
+        <w:t>1,2</w:t>
+      </w:r>
+      <w:r>
+        <w:t>…</w:t>
+      </w:r>
+      <w:r>
+        <w:rPr>
+          <w:rFonts w:hint="eastAsia"/>
+        </w:rPr>
+        <w:t>N</w:t>
+      </w:r>
+      <w:r>
+        <w:rPr>
+          <w:rFonts w:hint="eastAsia"/>
+        </w:rPr>
+        <w:t>。如果使用传统机器学习的方法处理，则需要人手动提取特征，但是这种操作很容易遗漏信息。此时，就引入神经网络，即让机器自动识别（模拟人的神经网络）</w:t>
+      </w:r>
+      <w:r>
+        <w:rPr>
+          <w:rFonts w:hint="eastAsia"/>
+          <w:color w:val="EE0000"/>
+        </w:rPr>
+        <w:t>非结构化数据</w:t>
+      </w:r>
+      <w:r>
+        <w:rPr>
+          <w:rFonts w:hint="eastAsia"/>
+        </w:rPr>
+        <w:t>。</w:t>
+      </w:r>
+    </w:p>
+    <w:p>
+      <w:pPr>
+        <w:jc w:val="center"/>
+        <w:rPr>
+          <w:rFonts w:hint="eastAsia"/>
+        </w:rPr>
+      </w:pPr>
+      <w:r>
+        <w:rPr>
+          <w:noProof/>
+        </w:rPr>
+        <w:drawing>
+          <wp:inline distT="0" distB="0" distL="0" distR="0" wp14:anchorId="2781EBF7" wp14:editId="64B23F12">
+            <wp:extent cx="4381855" cy="2002064"/>
+            <wp:effectExtent l="0" t="0" r="0" b="0"/>
+            <wp:docPr id="443745625" name="图片 1"/>
+            <wp:cNvGraphicFramePr>
+              <a:graphicFrameLocks xmlns:a="http://schemas.openxmlformats.org/drawingml/2006/main" noChangeAspect="1"/>
+            </wp:cNvGraphicFramePr>
+            <a:graphic xmlns:a="http://schemas.openxmlformats.org/drawingml/2006/main">
+              <a:graphicData uri="http://schemas.openxmlformats.org/drawingml/2006/picture">
+                <pic:pic xmlns:pic="http://schemas.openxmlformats.org/drawingml/2006/picture">
+                  <pic:nvPicPr>
+                    <pic:cNvPr id="443745625" name=""/>
+                    <pic:cNvPicPr/>
+                  </pic:nvPicPr>
+                  <pic:blipFill>
+                    <a:blip r:embed="rId5"/>
+                    <a:stretch>
+                      <a:fillRect/>
+                    </a:stretch>
+                  </pic:blipFill>
+                  <pic:spPr>
+                    <a:xfrm>
+                      <a:off x="0" y="0"/>
+                      <a:ext cx="4390529" cy="2006027"/>
+                    </a:xfrm>
+                    <a:prstGeom prst="rect">
+                      <a:avLst/>
+                    </a:prstGeom>
+                  </pic:spPr>
+                </pic:pic>
+              </a:graphicData>
+            </a:graphic>
+          </wp:inline>
+        </w:drawing>
+      </w:r>
+    </w:p>
     <w:p>
       <w:pPr>
         <w:pStyle w:val="1"/>
@@ -56,7 +185,7 @@
                     <pic:cNvPicPr/>
                   </pic:nvPicPr>
                   <pic:blipFill>
-                    <a:blip r:embed="rId4"/>
+                    <a:blip r:embed="rId6"/>
                     <a:stretch>
                       <a:fillRect/>
                     </a:stretch>
@@ -104,6 +233,7 @@
         <w:rPr>
           <w:rFonts w:hint="eastAsia"/>
         </w:rPr>
+        <w:lastRenderedPageBreak/>
         <w:t>原理</w:t>
       </w:r>
     </w:p>
@@ -132,7 +262,19 @@
         <w:rPr>
           <w:rFonts w:hint="eastAsia"/>
         </w:rPr>
-        <w:t>(Neuron)</w:t>
+        <w:t>（</w:t>
+      </w:r>
+      <w:r>
+        <w:rPr>
+          <w:rFonts w:hint="eastAsia"/>
+        </w:rPr>
+        <w:t>Neuron</w:t>
+      </w:r>
+      <w:r>
+        <w:rPr>
+          <w:rFonts w:hint="eastAsia"/>
+        </w:rPr>
+        <w:t>）</w:t>
       </w:r>
     </w:p>
     <w:p>
@@ -178,7 +320,7 @@
                     <pic:cNvPicPr/>
                   </pic:nvPicPr>
                   <pic:blipFill>
-                    <a:blip r:embed="rId5"/>
+                    <a:blip r:embed="rId7"/>
                     <a:stretch>
                       <a:fillRect/>
                     </a:stretch>
@@ -208,43 +350,252 @@
         <w:rPr>
           <w:rFonts w:hint="eastAsia"/>
         </w:rPr>
-        <w:t>相似地，在神经网络中，在收到输入的信号之后，神经元通过处理，然后把</w:t>
-      </w:r>
+        <w:t>相似地，在神经网络中，在收到输入的信号之后，神经元通过处理，然后把结果输出给其它的神经元或者直接作为最终的输出。</w:t>
+      </w:r>
+    </w:p>
+    <w:p>
+      <w:pPr>
+        <w:pStyle w:val="3"/>
+      </w:pPr>
+      <w:r>
+        <w:rPr>
+          <w:rFonts w:hint="eastAsia"/>
+        </w:rPr>
+        <w:t>加权</w:t>
+      </w:r>
+      <w:r>
+        <w:rPr>
+          <w:rFonts w:hint="eastAsia"/>
+        </w:rPr>
+        <w:t>/</w:t>
+      </w:r>
+      <w:r>
+        <w:rPr>
+          <w:rFonts w:hint="eastAsia"/>
+        </w:rPr>
+        <w:t>权重</w:t>
+      </w:r>
+      <w:r>
+        <w:rPr>
+          <w:rFonts w:hint="eastAsia"/>
+        </w:rPr>
+        <w:t>（</w:t>
+      </w:r>
+      <w:r>
+        <w:rPr>
+          <w:rFonts w:hint="eastAsia"/>
+        </w:rPr>
+        <w:t>Weights</w:t>
+      </w:r>
+      <w:r>
+        <w:rPr>
+          <w:rFonts w:hint="eastAsia"/>
+        </w:rPr>
+        <w:t>）</w:t>
+      </w:r>
+    </w:p>
+    <w:p>
+      <w:pPr>
+        <w:ind w:firstLine="420"/>
+      </w:pPr>
+      <w:r>
+        <w:rPr>
+          <w:rFonts w:hint="eastAsia"/>
+        </w:rPr>
+        <w:t>当输入信号进入到神经元后，会被乘以相应的</w:t>
+      </w:r>
+      <w:r>
+        <w:rPr>
+          <w:rFonts w:hint="eastAsia"/>
+          <w:color w:val="EE0000"/>
+        </w:rPr>
+        <w:t>权重因子</w:t>
+      </w:r>
+      <w:r>
+        <w:rPr>
+          <w:rFonts w:hint="eastAsia"/>
+        </w:rPr>
+        <w:t>。举例来说，假设一个神经元有两个输入信号，那么每个输入将会存在着一个与之相应的权重因子。在初始化网络的时候，这些权重会被随机设置，然后在训练模型的过程中再不断地发生更改。</w:t>
+      </w:r>
+    </w:p>
+    <w:p>
+      <w:pPr>
+        <w:ind w:firstLine="420"/>
+      </w:pPr>
+      <w:r>
+        <w:rPr>
+          <w:rFonts w:hint="eastAsia"/>
+        </w:rPr>
+        <w:t>在经过训练后的神经网络中，</w:t>
+      </w:r>
+      <w:r>
+        <w:rPr>
+          <w:rFonts w:hint="eastAsia"/>
+          <w:color w:val="EE0000"/>
+        </w:rPr>
+        <w:t>一个输入具有的权重因子越高，往往意味着它的重要性更高，对输出的影响越大。另一方面，当权重因子为</w:t>
+      </w:r>
+      <w:r>
+        <w:rPr>
+          <w:rFonts w:hint="eastAsia"/>
+          <w:color w:val="EE0000"/>
+        </w:rPr>
+        <w:t>0</w:t>
+      </w:r>
+      <w:r>
+        <w:rPr>
+          <w:rFonts w:hint="eastAsia"/>
+          <w:color w:val="EE0000"/>
+        </w:rPr>
+        <w:t>时意味着这个输入是无价值的。</w:t>
+      </w:r>
+    </w:p>
+    <w:p>
+      <w:pPr>
+        <w:ind w:firstLine="420"/>
+      </w:pPr>
+      <w:r>
+        <w:rPr>
+          <w:rFonts w:hint="eastAsia"/>
+        </w:rPr>
+        <w:t>假设输入为</w:t>
+      </w:r>
+      <w:r>
+        <w:rPr>
+          <w:rFonts w:hint="eastAsia"/>
+        </w:rPr>
+        <w:t>a</w:t>
+      </w:r>
+      <w:r>
+        <w:rPr>
+          <w:rFonts w:hint="eastAsia"/>
+        </w:rPr>
+        <w:t>，相应的权重为</w:t>
+      </w:r>
+      <w:r>
+        <w:rPr>
+          <w:rFonts w:hint="eastAsia"/>
+        </w:rPr>
+        <w:t>W1</w:t>
+      </w:r>
+      <w:r>
+        <w:rPr>
+          <w:rFonts w:hint="eastAsia"/>
+        </w:rPr>
+        <w:t>。那么通过赋权节点后相应的输入应变为</w:t>
+      </w:r>
+      <w:r>
+        <w:rPr>
+          <w:rFonts w:hint="eastAsia"/>
+        </w:rPr>
+        <w:t>a*W1</w:t>
+      </w:r>
+      <w:r>
+        <w:rPr>
+          <w:rFonts w:hint="eastAsia"/>
+        </w:rPr>
+        <w:t>。</w:t>
+      </w:r>
+    </w:p>
+    <w:p>
+      <w:pPr>
+        <w:pStyle w:val="3"/>
+      </w:pPr>
+      <w:r>
+        <w:rPr>
+          <w:rFonts w:hint="eastAsia"/>
+        </w:rPr>
+        <w:t>偏置</w:t>
+      </w:r>
+      <w:r>
+        <w:rPr>
+          <w:rFonts w:hint="eastAsia"/>
+        </w:rPr>
+        <w:t>/</w:t>
+      </w:r>
+      <w:r>
+        <w:rPr>
+          <w:rFonts w:hint="eastAsia"/>
+        </w:rPr>
+        <w:t>偏倚</w:t>
+      </w:r>
+      <w:r>
+        <w:rPr>
+          <w:rFonts w:hint="eastAsia"/>
+        </w:rPr>
+        <w:t>（</w:t>
+      </w:r>
+      <w:r>
+        <w:rPr>
+          <w:rFonts w:hint="eastAsia"/>
+        </w:rPr>
+        <w:t>Bias</w:t>
+      </w:r>
+      <w:r>
+        <w:rPr>
+          <w:rFonts w:hint="eastAsia"/>
+        </w:rPr>
+        <w:t>）</w:t>
+      </w:r>
+    </w:p>
+    <w:p>
+      <w:pPr>
+        <w:ind w:firstLine="420"/>
+      </w:pPr>
+      <w:r>
+        <w:rPr>
+          <w:rFonts w:hint="eastAsia"/>
+        </w:rPr>
+        <w:t>除了权重之外，输入还需要经过另外一种线性处理，叫做</w:t>
+      </w:r>
+      <w:r>
+        <w:rPr>
+          <w:rFonts w:hint="eastAsia"/>
+          <w:color w:val="EE0000"/>
+        </w:rPr>
+        <w:t>偏置</w:t>
+      </w:r>
+      <w:r>
+        <w:rPr>
+          <w:rFonts w:hint="eastAsia"/>
+        </w:rPr>
+        <w:t>。通过把偏置</w:t>
+      </w:r>
+      <w:r>
+        <w:rPr>
+          <w:rFonts w:hint="eastAsia"/>
+        </w:rPr>
+        <w:t>b</w:t>
+      </w:r>
+      <w:r>
+        <w:rPr>
+          <w:rFonts w:hint="eastAsia"/>
+        </w:rPr>
+        <w:t>与加权后的输入信号</w:t>
+      </w:r>
+      <w:r>
+        <w:rPr>
+          <w:rFonts w:hint="eastAsia"/>
+        </w:rPr>
+        <w:t>a*W1</w:t>
+      </w:r>
+      <w:r>
+        <w:rPr>
+          <w:rFonts w:hint="eastAsia"/>
+        </w:rPr>
+        <w:t>直接相加，以此作为激活函数的输入信号。</w:t>
+      </w:r>
+    </w:p>
+    <w:p>
+      <w:pPr>
+        <w:pStyle w:val="3"/>
+      </w:pPr>
       <w:r>
         <w:rPr>
           <w:rFonts w:hint="eastAsia"/>
         </w:rPr>
         <w:lastRenderedPageBreak/>
-        <w:t>结果输出给其它的神经元或者直接作为最终的输出。</w:t>
-      </w:r>
-    </w:p>
-    <w:p>
-      <w:pPr>
-        <w:pStyle w:val="3"/>
-      </w:pPr>
-      <w:r>
-        <w:rPr>
-          <w:rFonts w:hint="eastAsia"/>
-        </w:rPr>
-        <w:t>加权</w:t>
-      </w:r>
-      <w:r>
-        <w:rPr>
-          <w:rFonts w:hint="eastAsia"/>
-        </w:rPr>
-        <w:t>/</w:t>
-      </w:r>
-      <w:r>
-        <w:rPr>
-          <w:rFonts w:hint="eastAsia"/>
-        </w:rPr>
-        <w:t>权重</w:t>
-      </w:r>
-      <w:r>
-        <w:rPr>
-          <w:rFonts w:hint="eastAsia"/>
-        </w:rPr>
-        <w:t>(Weights)</w:t>
+        <w:t>激活函数</w:t>
       </w:r>
     </w:p>
     <w:p>
@@ -254,8 +605,40 @@
       <w:r>
         <w:rPr>
           <w:rFonts w:hint="eastAsia"/>
-        </w:rPr>
-        <w:t>当输入信号进入到神经元后，会被乘以相应的权重因子。举例来说，假设一个神经元有两个输入信号，那么每个输入将会存在着一个与之相应的权重因子。在初始化网络的时候，这些权重会被随机设置，然后在训练模型的过程中再不断地发生更改。</w:t>
+          <w:color w:val="EE0000"/>
+          <w:u w:val="single"/>
+        </w:rPr>
+        <w:t>之前线性处理之后的输入信号通过激活函数进行非线性变换，从而得到输出信号</w:t>
+      </w:r>
+      <w:r>
+        <w:rPr>
+          <w:rFonts w:hint="eastAsia"/>
+        </w:rPr>
+        <w:t>。即最后输出的信号具有</w:t>
+      </w:r>
+      <w:r>
+        <w:rPr>
+          <w:rFonts w:hint="eastAsia"/>
+        </w:rPr>
+        <w:t>f(a*W1+b)</w:t>
+      </w:r>
+      <w:r>
+        <w:rPr>
+          <w:rFonts w:hint="eastAsia"/>
+        </w:rPr>
+        <w:t>的形式，其中</w:t>
+      </w:r>
+      <w:r>
+        <w:rPr>
+          <w:rFonts w:hint="eastAsia"/>
+        </w:rPr>
+        <w:t>f()</w:t>
+      </w:r>
+      <w:r>
+        <w:rPr>
+          <w:rFonts w:hint="eastAsia"/>
+        </w:rPr>
+        <w:t>为激活函数。</w:t>
       </w:r>
     </w:p>
     <w:p>
@@ -266,106 +649,107 @@
         <w:rPr>
           <w:rFonts w:hint="eastAsia"/>
         </w:rPr>
-        <w:t>在经过训练后的神经网络中，一个输入具有的权重因子越高，往往意味着它的重要性更高，对输出的影响越大。另一方面，当权重因子为</w:t>
-      </w:r>
-      <w:r>
-        <w:rPr>
-          <w:rFonts w:hint="eastAsia"/>
-        </w:rPr>
-        <w:t>0</w:t>
-      </w:r>
-      <w:r>
-        <w:rPr>
-          <w:rFonts w:hint="eastAsia"/>
-        </w:rPr>
-        <w:t>时意味着这个输入是无价值的。</w:t>
-      </w:r>
-    </w:p>
-    <w:p>
-      <w:pPr>
-        <w:ind w:firstLine="420"/>
-      </w:pPr>
-      <w:r>
-        <w:rPr>
-          <w:rFonts w:hint="eastAsia"/>
-        </w:rPr>
-        <w:t>假设输入为</w:t>
-      </w:r>
-      <w:r>
-        <w:rPr>
-          <w:rFonts w:hint="eastAsia"/>
-        </w:rPr>
-        <w:t>a</w:t>
-      </w:r>
-      <w:r>
-        <w:rPr>
-          <w:rFonts w:hint="eastAsia"/>
-        </w:rPr>
-        <w:t>，相应的权重为</w:t>
-      </w:r>
-      <w:r>
-        <w:rPr>
-          <w:rFonts w:hint="eastAsia"/>
-        </w:rPr>
-        <w:t>W1</w:t>
-      </w:r>
-      <w:r>
-        <w:rPr>
-          <w:rFonts w:hint="eastAsia"/>
-        </w:rPr>
-        <w:t>。那么通过赋权节点后相应的输入应变为</w:t>
-      </w:r>
-      <w:r>
-        <w:rPr>
-          <w:rFonts w:hint="eastAsia"/>
-        </w:rPr>
-        <w:t>a*W1</w:t>
-      </w:r>
-      <w:r>
-        <w:rPr>
-          <w:rFonts w:hint="eastAsia"/>
-        </w:rPr>
-        <w:t>。</w:t>
-      </w:r>
-    </w:p>
-    <w:p>
-      <w:pPr>
-        <w:pStyle w:val="3"/>
-      </w:pPr>
-      <w:r>
-        <w:rPr>
-          <w:rFonts w:hint="eastAsia"/>
-        </w:rPr>
-        <w:t>偏置</w:t>
-      </w:r>
-      <w:r>
-        <w:rPr>
-          <w:rFonts w:hint="eastAsia"/>
-        </w:rPr>
-        <w:t>/</w:t>
-      </w:r>
-      <w:r>
-        <w:rPr>
-          <w:rFonts w:hint="eastAsia"/>
-        </w:rPr>
-        <w:t>偏倚</w:t>
-      </w:r>
-      <w:r>
-        <w:rPr>
-          <w:rFonts w:hint="eastAsia"/>
-        </w:rPr>
-        <w:t>(Bias)</w:t>
-      </w:r>
-    </w:p>
-    <w:p>
-      <w:pPr>
-        <w:ind w:firstLine="420"/>
-      </w:pPr>
-      <w:r>
-        <w:rPr>
-          <w:rFonts w:hint="eastAsia"/>
-        </w:rPr>
-        <w:t>除了权重之外，输入还需要经过另外一种线性处理，叫做偏置。通过把偏置</w:t>
+        <w:t>在下面的示意图中，</w:t>
+      </w:r>
+      <w:r>
+        <w:rPr>
+          <w:rFonts w:hint="eastAsia"/>
+        </w:rPr>
+        <w:t xml:space="preserve"> </w:t>
+      </w:r>
+      <w:r>
+        <w:rPr>
+          <w:rFonts w:hint="eastAsia"/>
+        </w:rPr>
+        <w:t>设</w:t>
+      </w:r>
+      <w:r>
+        <w:rPr>
+          <w:rFonts w:hint="eastAsia"/>
+        </w:rPr>
+        <w:t>X</w:t>
+      </w:r>
+      <w:r>
+        <w:rPr>
+          <w:rFonts w:hint="eastAsia"/>
+          <w:vertAlign w:val="subscript"/>
+        </w:rPr>
+        <w:t>1</w:t>
+      </w:r>
+      <w:r>
+        <w:rPr>
+          <w:rFonts w:hint="eastAsia"/>
+        </w:rPr>
+        <w:t>…</w:t>
+      </w:r>
+      <w:r>
+        <w:rPr>
+          <w:rFonts w:hint="eastAsia"/>
+        </w:rPr>
+        <w:t>X</w:t>
+      </w:r>
+      <w:r>
+        <w:rPr>
+          <w:rFonts w:hint="eastAsia"/>
+          <w:vertAlign w:val="subscript"/>
+        </w:rPr>
+        <w:t>n</w:t>
+      </w:r>
+      <w:r>
+        <w:rPr>
+          <w:rFonts w:hint="eastAsia"/>
+        </w:rPr>
+        <w:t>等</w:t>
+      </w:r>
+      <w:r>
+        <w:rPr>
+          <w:rFonts w:hint="eastAsia"/>
+        </w:rPr>
+        <w:t>n</w:t>
+      </w:r>
+      <w:r>
+        <w:rPr>
+          <w:rFonts w:hint="eastAsia"/>
+        </w:rPr>
+        <w:t>个输入分别对应着权重因子</w:t>
+      </w:r>
+      <w:r>
+        <w:rPr>
+          <w:rFonts w:hint="eastAsia"/>
+        </w:rPr>
+        <w:t>W</w:t>
+      </w:r>
+      <w:r>
+        <w:rPr>
+          <w:rFonts w:hint="eastAsia"/>
+          <w:vertAlign w:val="subscript"/>
+        </w:rPr>
+        <w:t>k1</w:t>
+      </w:r>
+      <w:r>
+        <w:rPr>
+          <w:rFonts w:hint="eastAsia"/>
+        </w:rPr>
+        <w:t>…</w:t>
+      </w:r>
+      <w:r>
+        <w:rPr>
+          <w:rFonts w:hint="eastAsia"/>
+        </w:rPr>
+        <w:t>W</w:t>
+      </w:r>
+      <w:r>
+        <w:rPr>
+          <w:rFonts w:hint="eastAsia"/>
+          <w:vertAlign w:val="subscript"/>
+        </w:rPr>
+        <w:t>kn</w:t>
+      </w:r>
+      <w:r>
+        <w:rPr>
+          <w:rFonts w:hint="eastAsia"/>
+        </w:rPr>
+        <w:t>以及相应的偏置</w:t>
       </w:r>
       <w:r>
         <w:rPr>
@@ -376,95 +760,9 @@
       <w:r>
         <w:rPr>
           <w:rFonts w:hint="eastAsia"/>
-        </w:rPr>
-        <w:t>与加权后的输入信号</w:t>
-      </w:r>
-      <w:r>
-        <w:rPr>
-          <w:rFonts w:hint="eastAsia"/>
-        </w:rPr>
-        <w:t>a*W1</w:t>
-      </w:r>
-      <w:r>
-        <w:rPr>
-          <w:rFonts w:hint="eastAsia"/>
-        </w:rPr>
-        <w:t>直接相加，以此作为激活函数的输入信号。</w:t>
-      </w:r>
-    </w:p>
-    <w:p>
-      <w:pPr>
-        <w:pStyle w:val="3"/>
-      </w:pPr>
-      <w:r>
-        <w:rPr>
-          <w:rFonts w:hint="eastAsia"/>
-        </w:rPr>
-        <w:t>激活函数</w:t>
-      </w:r>
-    </w:p>
-    <w:p>
-      <w:pPr>
-        <w:ind w:firstLine="420"/>
-      </w:pPr>
-      <w:r>
-        <w:rPr>
-          <w:rFonts w:hint="eastAsia"/>
-        </w:rPr>
-        <w:t>之前线性处理之后的输入信号通过激活函数进行非线性变换，从而得到输出信号。即最后输出的信号具有</w:t>
-      </w:r>
-      <w:r>
-        <w:rPr>
-          <w:rFonts w:hint="eastAsia"/>
-        </w:rPr>
-        <w:t>f(a*W1+b)</w:t>
-      </w:r>
-      <w:r>
-        <w:rPr>
-          <w:rFonts w:hint="eastAsia"/>
-        </w:rPr>
-        <w:t>的形式，其中</w:t>
-      </w:r>
-      <w:r>
-        <w:rPr>
-          <w:rFonts w:hint="eastAsia"/>
-        </w:rPr>
-        <w:t>f()</w:t>
-      </w:r>
-      <w:r>
-        <w:rPr>
-          <w:rFonts w:hint="eastAsia"/>
-        </w:rPr>
-        <w:t>为激活函数。</w:t>
-      </w:r>
-    </w:p>
-    <w:p>
-      <w:pPr>
-        <w:ind w:firstLine="420"/>
-      </w:pPr>
-      <w:r>
-        <w:rPr>
-          <w:rFonts w:hint="eastAsia"/>
-        </w:rPr>
-        <w:t>在下面的示意图中，</w:t>
-      </w:r>
-      <w:r>
-        <w:rPr>
-          <w:rFonts w:hint="eastAsia"/>
-        </w:rPr>
-        <w:t xml:space="preserve"> </w:t>
-      </w:r>
-      <w:r>
-        <w:rPr>
-          <w:rFonts w:hint="eastAsia"/>
-        </w:rPr>
-        <w:t>设</w:t>
-      </w:r>
-      <w:r>
-        <w:rPr>
-          <w:rFonts w:hint="eastAsia"/>
-        </w:rPr>
-        <w:t>X1</w:t>
+          <w:vertAlign w:val="subscript"/>
+        </w:rPr>
+        <w:t>1</w:t>
       </w:r>
       <w:r>
         <w:rPr>
@@ -476,17 +774,12 @@
         <w:rPr>
           <w:rFonts w:hint="eastAsia"/>
         </w:rPr>
-        <w:t>Xn</w:t>
-      </w:r>
-      <w:r>
-        <w:rPr>
-          <w:rFonts w:hint="eastAsia"/>
-        </w:rPr>
-        <w:t>等</w:t>
-      </w:r>
-      <w:r>
-        <w:rPr>
-          <w:rFonts w:hint="eastAsia"/>
+        <w:t>b</w:t>
+      </w:r>
+      <w:r>
+        <w:rPr>
+          <w:rFonts w:hint="eastAsia"/>
+          <w:vertAlign w:val="subscript"/>
         </w:rPr>
         <w:t>n</w:t>
       </w:r>
@@ -494,61 +787,20 @@
         <w:rPr>
           <w:rFonts w:hint="eastAsia"/>
         </w:rPr>
-        <w:t>个输入分别对应着权重因子</w:t>
-      </w:r>
-      <w:r>
-        <w:rPr>
-          <w:rFonts w:hint="eastAsia"/>
-        </w:rPr>
-        <w:t>Wk1</w:t>
-      </w:r>
-      <w:r>
-        <w:rPr>
-          <w:rFonts w:hint="eastAsia"/>
-        </w:rPr>
-        <w:t>…</w:t>
-      </w:r>
-      <w:r>
-        <w:rPr>
-          <w:rFonts w:hint="eastAsia"/>
-        </w:rPr>
-        <w:t>Wkn</w:t>
-      </w:r>
-      <w:r>
-        <w:rPr>
-          <w:rFonts w:hint="eastAsia"/>
-        </w:rPr>
-        <w:t>以及相应的偏置</w:t>
-      </w:r>
-      <w:r>
-        <w:rPr>
-          <w:rFonts w:hint="eastAsia"/>
-        </w:rPr>
-        <w:t>b1</w:t>
-      </w:r>
-      <w:r>
-        <w:rPr>
-          <w:rFonts w:hint="eastAsia"/>
-        </w:rPr>
-        <w:t>…</w:t>
-      </w:r>
-      <w:r>
-        <w:rPr>
-          <w:rFonts w:hint="eastAsia"/>
-        </w:rPr>
-        <w:t>bn</w:t>
-      </w:r>
-      <w:r>
-        <w:rPr>
-          <w:rFonts w:hint="eastAsia"/>
-        </w:rPr>
         <w:t>。我们把输入</w:t>
       </w:r>
       <w:r>
         <w:rPr>
           <w:rFonts w:hint="eastAsia"/>
         </w:rPr>
-        <w:t>Xi</w:t>
+        <w:t>X</w:t>
+      </w:r>
+      <w:r>
+        <w:rPr>
+          <w:rFonts w:hint="eastAsia"/>
+          <w:vertAlign w:val="subscript"/>
+        </w:rPr>
+        <w:t>i</w:t>
       </w:r>
       <w:r>
         <w:rPr>
@@ -560,7 +812,14 @@
         <w:rPr>
           <w:rFonts w:hint="eastAsia"/>
         </w:rPr>
-        <w:t>Wki</w:t>
+        <w:t>W</w:t>
+      </w:r>
+      <w:r>
+        <w:rPr>
+          <w:rFonts w:hint="eastAsia"/>
+          <w:vertAlign w:val="subscript"/>
+        </w:rPr>
+        <w:t>ki</w:t>
       </w:r>
       <w:r>
         <w:rPr>
@@ -572,7 +831,14 @@
         <w:rPr>
           <w:rFonts w:hint="eastAsia"/>
         </w:rPr>
-        <w:t>bi</w:t>
+        <w:t>b</w:t>
+      </w:r>
+      <w:r>
+        <w:rPr>
+          <w:rFonts w:hint="eastAsia"/>
+          <w:vertAlign w:val="subscript"/>
+        </w:rPr>
+        <w:t>i</w:t>
       </w:r>
       <w:r>
         <w:rPr>
@@ -654,7 +920,7 @@
                     <pic:cNvPicPr/>
                   </pic:nvPicPr>
                   <pic:blipFill>
-                    <a:blip r:embed="rId6"/>
+                    <a:blip r:embed="rId8"/>
                     <a:stretch>
                       <a:fillRect/>
                     </a:stretch>
@@ -784,7 +1050,6 @@
         <w:rPr>
           <w:rFonts w:hint="eastAsia"/>
         </w:rPr>
-        <w:lastRenderedPageBreak/>
         <w:t>Sigmoid</w:t>
       </w:r>
       <w:r>
@@ -826,7 +1091,7 @@
                     <pic:cNvPicPr/>
                   </pic:nvPicPr>
                   <pic:blipFill>
-                    <a:blip r:embed="rId7"/>
+                    <a:blip r:embed="rId9"/>
                     <a:stretch>
                       <a:fillRect/>
                     </a:stretch>
@@ -903,7 +1168,7 @@
         <w:rPr>
           <w:rFonts w:hint="eastAsia"/>
         </w:rPr>
-        <w:t>(</w:t>
+        <w:t>（</w:t>
       </w:r>
       <w:r>
         <w:rPr>
@@ -927,7 +1192,7 @@
         <w:rPr>
           <w:rFonts w:hint="eastAsia"/>
         </w:rPr>
-        <w:t>)</w:t>
+        <w:t>）</w:t>
       </w:r>
       <w:r>
         <w:rPr>
@@ -950,13 +1215,19 @@
         <w:rPr>
           <w:rFonts w:hint="eastAsia"/>
         </w:rPr>
-        <w:t>(ReLU</w:t>
-      </w:r>
-      <w:r>
-        <w:rPr>
-          <w:rFonts w:hint="eastAsia"/>
-        </w:rPr>
-        <w:t>)</w:t>
+        <w:t>（</w:t>
+      </w:r>
+      <w:r>
+        <w:rPr>
+          <w:rFonts w:hint="eastAsia"/>
+        </w:rPr>
+        <w:t>ReLU</w:t>
+      </w:r>
+      <w:r>
+        <w:rPr>
+          <w:rFonts w:hint="eastAsia"/>
+        </w:rPr>
+        <w:t>）</w:t>
       </w:r>
     </w:p>
     <w:p>
@@ -1025,6 +1296,7 @@
         <w:rPr>
           <w:noProof/>
         </w:rPr>
+        <w:lastRenderedPageBreak/>
         <w:drawing>
           <wp:anchor distT="0" distB="0" distL="114300" distR="114300" simplePos="0" relativeHeight="251663360" behindDoc="0" locked="0" layoutInCell="1" allowOverlap="1" wp14:anchorId="5B7E3E35" wp14:editId="5C1655EC">
             <wp:simplePos x="0" y="0"/>
@@ -1049,7 +1321,7 @@
                     <pic:cNvPicPr/>
                   </pic:nvPicPr>
                   <pic:blipFill>
-                    <a:blip r:embed="rId8"/>
+                    <a:blip r:embed="rId10"/>
                     <a:stretch>
                       <a:fillRect/>
                     </a:stretch>
@@ -1266,7 +1538,6 @@
         <w:rPr>
           <w:noProof/>
         </w:rPr>
-        <w:lastRenderedPageBreak/>
         <w:drawing>
           <wp:anchor distT="0" distB="0" distL="114300" distR="114300" simplePos="0" relativeHeight="251689984" behindDoc="0" locked="0" layoutInCell="1" allowOverlap="1" wp14:anchorId="4FF76BA4" wp14:editId="312C7C9F">
             <wp:simplePos x="0" y="0"/>
@@ -1291,7 +1562,7 @@
                     <pic:cNvPicPr/>
                   </pic:nvPicPr>
                   <pic:blipFill>
-                    <a:blip r:embed="rId9"/>
+                    <a:blip r:embed="rId11"/>
                     <a:stretch>
                       <a:fillRect/>
                     </a:stretch>
@@ -1399,6 +1670,7 @@
         <w:rPr>
           <w:noProof/>
         </w:rPr>
+        <w:lastRenderedPageBreak/>
         <w:drawing>
           <wp:anchor distT="0" distB="0" distL="114300" distR="114300" simplePos="0" relativeHeight="251692032" behindDoc="0" locked="0" layoutInCell="1" allowOverlap="1" wp14:anchorId="731187F6" wp14:editId="4923A92A">
             <wp:simplePos x="0" y="0"/>
@@ -1423,7 +1695,7 @@
                     <pic:cNvPicPr/>
                   </pic:nvPicPr>
                   <pic:blipFill>
-                    <a:blip r:embed="rId10"/>
+                    <a:blip r:embed="rId12"/>
                     <a:stretch>
                       <a:fillRect/>
                     </a:stretch>
@@ -1471,6 +1743,359 @@
       </w:r>
     </w:p>
     <w:p>
+      <w:r>
+        <w:tab/>
+      </w:r>
+      <w:r>
+        <w:rPr>
+          <w:rFonts w:hint="eastAsia"/>
+        </w:rPr>
+        <w:t>单层感知机只能处理线性可分的问题，如果遇到异或问题，则线性就很难区分开（即很难用一条直接切分开）。</w:t>
+      </w:r>
+    </w:p>
+    <w:p>
+      <w:pPr>
+        <w:jc w:val="center"/>
+      </w:pPr>
+      <w:r>
+        <w:rPr>
+          <w:noProof/>
+        </w:rPr>
+        <w:drawing>
+          <wp:inline distT="0" distB="0" distL="0" distR="0" wp14:anchorId="2D09DCE7" wp14:editId="07286B76">
+            <wp:extent cx="2633472" cy="1940453"/>
+            <wp:effectExtent l="0" t="0" r="0" b="3175"/>
+            <wp:docPr id="1485801879" name="图片 1"/>
+            <wp:cNvGraphicFramePr>
+              <a:graphicFrameLocks xmlns:a="http://schemas.openxmlformats.org/drawingml/2006/main" noChangeAspect="1"/>
+            </wp:cNvGraphicFramePr>
+            <a:graphic xmlns:a="http://schemas.openxmlformats.org/drawingml/2006/main">
+              <a:graphicData uri="http://schemas.openxmlformats.org/drawingml/2006/picture">
+                <pic:pic xmlns:pic="http://schemas.openxmlformats.org/drawingml/2006/picture">
+                  <pic:nvPicPr>
+                    <pic:cNvPr id="1485801879" name=""/>
+                    <pic:cNvPicPr/>
+                  </pic:nvPicPr>
+                  <pic:blipFill>
+                    <a:blip r:embed="rId13"/>
+                    <a:stretch>
+                      <a:fillRect/>
+                    </a:stretch>
+                  </pic:blipFill>
+                  <pic:spPr>
+                    <a:xfrm>
+                      <a:off x="0" y="0"/>
+                      <a:ext cx="2636687" cy="1942822"/>
+                    </a:xfrm>
+                    <a:prstGeom prst="rect">
+                      <a:avLst/>
+                    </a:prstGeom>
+                  </pic:spPr>
+                </pic:pic>
+              </a:graphicData>
+            </a:graphic>
+          </wp:inline>
+        </w:drawing>
+      </w:r>
+    </w:p>
+    <w:p>
+      <w:r>
+        <w:tab/>
+      </w:r>
+      <w:r>
+        <w:rPr>
+          <w:rFonts w:hint="eastAsia"/>
+        </w:rPr>
+        <w:t>于是，我们思考是否可以将这些比较难分类的点</w:t>
+      </w:r>
+      <w:r>
+        <w:rPr>
+          <w:rFonts w:hint="eastAsia"/>
+          <w:color w:val="EE0000"/>
+        </w:rPr>
+        <w:t>变换一下位置</w:t>
+      </w:r>
+      <w:r>
+        <w:rPr>
+          <w:rFonts w:hint="eastAsia"/>
+        </w:rPr>
+        <w:t>，比如把红色点上移，蓝色点下移，此时再用一条直线就能比较轻松切分开了。</w:t>
+      </w:r>
+    </w:p>
+    <w:p>
+      <w:pPr>
+        <w:jc w:val="center"/>
+      </w:pPr>
+      <w:r>
+        <w:rPr>
+          <w:noProof/>
+        </w:rPr>
+        <w:drawing>
+          <wp:inline distT="0" distB="0" distL="0" distR="0" wp14:anchorId="143D4D4E" wp14:editId="6CBF02F6">
+            <wp:extent cx="3708806" cy="2852355"/>
+            <wp:effectExtent l="0" t="0" r="6350" b="5715"/>
+            <wp:docPr id="423362313" name="图片 1"/>
+            <wp:cNvGraphicFramePr>
+              <a:graphicFrameLocks xmlns:a="http://schemas.openxmlformats.org/drawingml/2006/main" noChangeAspect="1"/>
+            </wp:cNvGraphicFramePr>
+            <a:graphic xmlns:a="http://schemas.openxmlformats.org/drawingml/2006/main">
+              <a:graphicData uri="http://schemas.openxmlformats.org/drawingml/2006/picture">
+                <pic:pic xmlns:pic="http://schemas.openxmlformats.org/drawingml/2006/picture">
+                  <pic:nvPicPr>
+                    <pic:cNvPr id="423362313" name=""/>
+                    <pic:cNvPicPr/>
+                  </pic:nvPicPr>
+                  <pic:blipFill>
+                    <a:blip r:embed="rId14"/>
+                    <a:stretch>
+                      <a:fillRect/>
+                    </a:stretch>
+                  </pic:blipFill>
+                  <pic:spPr>
+                    <a:xfrm>
+                      <a:off x="0" y="0"/>
+                      <a:ext cx="3716045" cy="2857922"/>
+                    </a:xfrm>
+                    <a:prstGeom prst="rect">
+                      <a:avLst/>
+                    </a:prstGeom>
+                  </pic:spPr>
+                </pic:pic>
+              </a:graphicData>
+            </a:graphic>
+          </wp:inline>
+        </w:drawing>
+      </w:r>
+    </w:p>
+    <w:p>
+      <w:r>
+        <w:lastRenderedPageBreak/>
+        <w:tab/>
+      </w:r>
+      <w:r>
+        <w:rPr>
+          <w:rFonts w:hint="eastAsia"/>
+        </w:rPr>
+        <w:t>但是拉点的这个操作，单层感知机是做不到的，因为它没有处理点位置的中间环节（即隐藏层，因为它只有一层），这时候多层感知机的概念就提出来了。</w:t>
+      </w:r>
+      <w:r>
+        <w:rPr>
+          <w:rFonts w:hint="eastAsia"/>
+        </w:rPr>
+        <w:t>因为它增加了一个隐藏层，这个层主要就是负责上面所述的“拉点”的工作，把原始的数据做进一步的转换，然后再输出。</w:t>
+      </w:r>
+    </w:p>
+    <w:p>
+      <w:pPr>
+        <w:jc w:val="center"/>
+      </w:pPr>
+      <w:r>
+        <w:rPr>
+          <w:noProof/>
+        </w:rPr>
+        <w:drawing>
+          <wp:inline distT="0" distB="0" distL="0" distR="0" wp14:anchorId="4BFF0156" wp14:editId="23420C6D">
+            <wp:extent cx="3789274" cy="2832464"/>
+            <wp:effectExtent l="0" t="0" r="1905" b="6350"/>
+            <wp:docPr id="797370324" name="图片 1"/>
+            <wp:cNvGraphicFramePr>
+              <a:graphicFrameLocks xmlns:a="http://schemas.openxmlformats.org/drawingml/2006/main" noChangeAspect="1"/>
+            </wp:cNvGraphicFramePr>
+            <a:graphic xmlns:a="http://schemas.openxmlformats.org/drawingml/2006/main">
+              <a:graphicData uri="http://schemas.openxmlformats.org/drawingml/2006/picture">
+                <pic:pic xmlns:pic="http://schemas.openxmlformats.org/drawingml/2006/picture">
+                  <pic:nvPicPr>
+                    <pic:cNvPr id="797370324" name=""/>
+                    <pic:cNvPicPr/>
+                  </pic:nvPicPr>
+                  <pic:blipFill>
+                    <a:blip r:embed="rId15"/>
+                    <a:stretch>
+                      <a:fillRect/>
+                    </a:stretch>
+                  </pic:blipFill>
+                  <pic:spPr>
+                    <a:xfrm>
+                      <a:off x="0" y="0"/>
+                      <a:ext cx="3792941" cy="2835205"/>
+                    </a:xfrm>
+                    <a:prstGeom prst="rect">
+                      <a:avLst/>
+                    </a:prstGeom>
+                  </pic:spPr>
+                </pic:pic>
+              </a:graphicData>
+            </a:graphic>
+          </wp:inline>
+        </w:drawing>
+      </w:r>
+    </w:p>
+    <w:p>
+      <w:r>
+        <w:tab/>
+      </w:r>
+      <w:r>
+        <w:rPr>
+          <w:rFonts w:hint="eastAsia"/>
+        </w:rPr>
+        <w:t>那么有了多层感知机后，不同层之间的权重怎么确定？这里的权重可以理解为每一层的解题步骤，早起就是凑数试错，非常繁琐。直到</w:t>
+      </w:r>
+      <w:r>
+        <w:rPr>
+          <w:rFonts w:hint="eastAsia"/>
+        </w:rPr>
+        <w:t>Hilton</w:t>
+      </w:r>
+      <w:r>
+        <w:rPr>
+          <w:rFonts w:hint="eastAsia"/>
+        </w:rPr>
+        <w:t>提出</w:t>
+      </w:r>
+      <w:r>
+        <w:rPr>
+          <w:rFonts w:hint="eastAsia"/>
+        </w:rPr>
+        <w:t>BP</w:t>
+      </w:r>
+      <w:r>
+        <w:rPr>
+          <w:rFonts w:hint="eastAsia"/>
+        </w:rPr>
+        <w:t>算法，一开始随机一个输入，然后根据误差反馈不断调整参数。这样就能很快找到每一层合适的参数</w:t>
+      </w:r>
+      <w:r>
+        <w:rPr>
+          <w:rFonts w:hint="eastAsia"/>
+        </w:rPr>
+        <w:t>/</w:t>
+      </w:r>
+      <w:r>
+        <w:rPr>
+          <w:rFonts w:hint="eastAsia"/>
+        </w:rPr>
+        <w:t>权重，因此网络的深度可以不断增加。</w:t>
+      </w:r>
+    </w:p>
+    <w:p>
+      <w:pPr>
+        <w:rPr>
+          <w:rFonts w:hint="eastAsia"/>
+        </w:rPr>
+      </w:pPr>
+      <w:r>
+        <w:tab/>
+      </w:r>
+      <w:r>
+        <w:rPr>
+          <w:rFonts w:hint="eastAsia"/>
+        </w:rPr>
+        <w:t>但是，随着网络层的增加，会出现梯度消失和梯度爆炸问题，</w:t>
+      </w:r>
+      <w:r>
+        <w:rPr>
+          <w:rFonts w:hint="eastAsia"/>
+        </w:rPr>
+        <w:t>Hilton</w:t>
+      </w:r>
+      <w:r>
+        <w:rPr>
+          <w:rFonts w:hint="eastAsia"/>
+        </w:rPr>
+        <w:t>提出</w:t>
+      </w:r>
+      <w:r>
+        <w:rPr>
+          <w:rFonts w:hint="eastAsia"/>
+          <w:color w:val="EE0000"/>
+        </w:rPr>
+        <w:t>深度信念网络</w:t>
+      </w:r>
+      <w:r>
+        <w:rPr>
+          <w:rFonts w:hint="eastAsia"/>
+        </w:rPr>
+        <w:t>，即基于</w:t>
+      </w:r>
+      <w:r>
+        <w:rPr>
+          <w:rFonts w:hint="eastAsia"/>
+          <w:color w:val="EE0000"/>
+        </w:rPr>
+        <w:t>预训练</w:t>
+      </w:r>
+      <w:r>
+        <w:rPr>
+          <w:rFonts w:hint="eastAsia"/>
+          <w:color w:val="EE0000"/>
+        </w:rPr>
+        <w:t>+</w:t>
+      </w:r>
+      <w:r>
+        <w:rPr>
+          <w:rFonts w:hint="eastAsia"/>
+          <w:color w:val="EE0000"/>
+        </w:rPr>
+        <w:t>微调技术</w:t>
+      </w:r>
+      <w:r>
+        <w:rPr>
+          <w:rFonts w:hint="eastAsia"/>
+        </w:rPr>
+        <w:t>实现。基本实现思路是，先把预训练分为两步，第一步先给神经网络做一个逐层预训练，比如先训练输入层和第一层隐藏层，用</w:t>
+      </w:r>
+      <w:r>
+        <w:rPr>
+          <w:rFonts w:hint="eastAsia"/>
+          <w:color w:val="EE0000"/>
+        </w:rPr>
+        <w:t>无监督学习</w:t>
+      </w:r>
+      <w:r>
+        <w:rPr>
+          <w:rFonts w:hint="eastAsia"/>
+        </w:rPr>
+        <w:t>，让这两层练会抓数据基础特征，然后把第一层训练好之后，再以此为输入再和第二层模块接着训练，一层一层进行，避免一上来全部训练导致权重无法收敛。等每一层都比较稳定了，再用</w:t>
+      </w:r>
+      <w:r>
+        <w:rPr>
+          <w:rFonts w:hint="eastAsia"/>
+        </w:rPr>
+        <w:t>BP</w:t>
+      </w:r>
+      <w:r>
+        <w:rPr>
+          <w:rFonts w:hint="eastAsia"/>
+        </w:rPr>
+        <w:t>算法进行整体微调。此时，由于每一层的权重有了一个比较靠谱的初始值，梯度就不太容易消失或爆炸</w:t>
+      </w:r>
+      <w:r>
+        <w:rPr>
+          <w:rFonts w:hint="eastAsia"/>
+        </w:rPr>
+        <w:t>，能够精准调参，这样网络就能做的更深</w:t>
+      </w:r>
+      <w:r>
+        <w:rPr>
+          <w:rFonts w:hint="eastAsia"/>
+        </w:rPr>
+        <w:t>，</w:t>
+      </w:r>
+      <w:r>
+        <w:rPr>
+          <w:rFonts w:hint="eastAsia"/>
+          <w:color w:val="EE0000"/>
+        </w:rPr>
+        <w:t>深度学习</w:t>
+      </w:r>
+      <w:r>
+        <w:rPr>
+          <w:rFonts w:hint="eastAsia"/>
+        </w:rPr>
+        <w:t>的概念由此诞生。</w:t>
+      </w:r>
+    </w:p>
+    <w:p>
       <w:pPr>
         <w:pStyle w:val="3"/>
       </w:pPr>
@@ -1513,7 +2138,14 @@
         <w:rPr>
           <w:rFonts w:hint="eastAsia"/>
         </w:rPr>
-        <w:t>从名字中就能看出，输入层代表接受输入数据的一层，基本上是网络的第一层；输出层是产生输出的一层，或者是网络的最后一层，而网络中间的处理层叫做隐藏层。</w:t>
+        <w:t>从名字中就能看出，输入层代表接受输入数据的一层，基本上是网络的第一层；输出层是产生输出的一层，或者是网络的最后一层，而网络中间的处理层叫</w:t>
+      </w:r>
+      <w:r>
+        <w:rPr>
+          <w:rFonts w:hint="eastAsia"/>
+        </w:rPr>
+        <w:lastRenderedPageBreak/>
+        <w:t>做隐藏层。</w:t>
       </w:r>
     </w:p>
     <w:p>
@@ -1548,7 +2180,7 @@
                     <pic:cNvPicPr/>
                   </pic:nvPicPr>
                   <pic:blipFill>
-                    <a:blip r:embed="rId11"/>
+                    <a:blip r:embed="rId16"/>
                     <a:stretch>
                       <a:fillRect/>
                     </a:stretch>
@@ -1589,14 +2221,25 @@
         <w:rPr>
           <w:rFonts w:hint="eastAsia"/>
         </w:rPr>
-        <w:lastRenderedPageBreak/>
         <w:t>正向传播</w:t>
       </w:r>
       <w:r>
         <w:rPr>
           <w:rFonts w:hint="eastAsia"/>
         </w:rPr>
-        <w:t>(forward propagation)</w:t>
+        <w:t>（</w:t>
+      </w:r>
+      <w:r>
+        <w:rPr>
+          <w:rFonts w:hint="eastAsia"/>
+        </w:rPr>
+        <w:t>forward propagation</w:t>
+      </w:r>
+      <w:r>
+        <w:rPr>
+          <w:rFonts w:hint="eastAsia"/>
+        </w:rPr>
+        <w:t>）</w:t>
       </w:r>
     </w:p>
     <w:p>
@@ -1624,7 +2267,19 @@
         <w:rPr>
           <w:rFonts w:hint="eastAsia"/>
         </w:rPr>
-        <w:t>(cost function)</w:t>
+        <w:t>（</w:t>
+      </w:r>
+      <w:r>
+        <w:rPr>
+          <w:rFonts w:hint="eastAsia"/>
+        </w:rPr>
+        <w:t>cost function</w:t>
+      </w:r>
+      <w:r>
+        <w:rPr>
+          <w:rFonts w:hint="eastAsia"/>
+        </w:rPr>
+        <w:t>）</w:t>
       </w:r>
     </w:p>
     <w:p>
@@ -1764,7 +2419,19 @@
         <w:rPr>
           <w:rFonts w:hint="eastAsia"/>
         </w:rPr>
-        <w:t>(gradient descent)</w:t>
+        <w:t>（</w:t>
+      </w:r>
+      <w:r>
+        <w:rPr>
+          <w:rFonts w:hint="eastAsia"/>
+        </w:rPr>
+        <w:t>gradient descent</w:t>
+      </w:r>
+      <w:r>
+        <w:rPr>
+          <w:rFonts w:hint="eastAsia"/>
+        </w:rPr>
+        <w:t>）</w:t>
       </w:r>
     </w:p>
     <w:p>
@@ -1839,15 +2506,24 @@
         <w:rPr>
           <w:rFonts w:hint="eastAsia"/>
         </w:rPr>
-        <w:t>(learning rate)</w:t>
+        <w:t>（</w:t>
+      </w:r>
+      <w:r>
+        <w:rPr>
+          <w:rFonts w:hint="eastAsia"/>
+        </w:rPr>
+        <w:t>learning rate</w:t>
+      </w:r>
+      <w:r>
+        <w:rPr>
+          <w:rFonts w:hint="eastAsia"/>
+        </w:rPr>
+        <w:t>）</w:t>
       </w:r>
     </w:p>
     <w:p>
       <w:pPr>
         <w:ind w:firstLine="420"/>
-        <w:rPr>
-          <w:rFonts w:hint="eastAsia"/>
-        </w:rPr>
       </w:pPr>
       <w:r>
         <w:rPr>
@@ -1889,7 +2565,7 @@
                     <pic:cNvPicPr/>
                   </pic:nvPicPr>
                   <pic:blipFill>
-                    <a:blip r:embed="rId12"/>
+                    <a:blip r:embed="rId17"/>
                     <a:stretch>
                       <a:fillRect/>
                     </a:stretch>
@@ -1925,7 +2601,19 @@
         <w:rPr>
           <w:rFonts w:hint="eastAsia"/>
         </w:rPr>
-        <w:t>(back propagation)</w:t>
+        <w:t>（</w:t>
+      </w:r>
+      <w:r>
+        <w:rPr>
+          <w:rFonts w:hint="eastAsia"/>
+        </w:rPr>
+        <w:t>back propagation</w:t>
+      </w:r>
+      <w:r>
+        <w:rPr>
+          <w:rFonts w:hint="eastAsia"/>
+        </w:rPr>
+        <w:t>）</w:t>
       </w:r>
     </w:p>
     <w:p>
@@ -2016,7 +2704,19 @@
         <w:rPr>
           <w:rFonts w:hint="eastAsia"/>
         </w:rPr>
-        <w:t>(epochs)</w:t>
+        <w:t>（</w:t>
+      </w:r>
+      <w:r>
+        <w:rPr>
+          <w:rFonts w:hint="eastAsia"/>
+        </w:rPr>
+        <w:t>epochs</w:t>
+      </w:r>
+      <w:r>
+        <w:rPr>
+          <w:rFonts w:hint="eastAsia"/>
+        </w:rPr>
+        <w:t>）</w:t>
       </w:r>
     </w:p>
     <w:p>
@@ -2150,7 +2850,7 @@
                     <pic:cNvPicPr/>
                   </pic:nvPicPr>
                   <pic:blipFill>
-                    <a:blip r:embed="rId13"/>
+                    <a:blip r:embed="rId18"/>
                     <a:stretch>
                       <a:fillRect/>
                     </a:stretch>
@@ -2209,7 +2909,19 @@
         <w:rPr>
           <w:rFonts w:hint="eastAsia"/>
         </w:rPr>
-        <w:t>(Batch Normalization)</w:t>
+        <w:t>（</w:t>
+      </w:r>
+      <w:r>
+        <w:rPr>
+          <w:rFonts w:hint="eastAsia"/>
+        </w:rPr>
+        <w:t>Batch Normalization</w:t>
+      </w:r>
+      <w:r>
+        <w:rPr>
+          <w:rFonts w:hint="eastAsia"/>
+        </w:rPr>
+        <w:t>）</w:t>
       </w:r>
     </w:p>
     <w:p>
@@ -2244,7 +2956,7 @@
                     <pic:cNvPicPr/>
                   </pic:nvPicPr>
                   <pic:blipFill>
-                    <a:blip r:embed="rId14"/>
+                    <a:blip r:embed="rId19"/>
                     <a:stretch>
                       <a:fillRect/>
                     </a:stretch>
@@ -2292,16 +3004,13 @@
     <w:p>
       <w:pPr>
         <w:pStyle w:val="1"/>
-        <w:rPr>
-          <w:rFonts w:hint="eastAsia"/>
-        </w:rPr>
       </w:pPr>
       <w:r>
         <w:rPr>
           <w:rFonts w:hint="eastAsia"/>
         </w:rPr>
         <w:lastRenderedPageBreak/>
-        <w:t>多层感知器</w:t>
+        <w:t>分类</w:t>
       </w:r>
     </w:p>
     <w:p>
@@ -2325,6 +3034,136 @@
         </w:rPr>
         <w:t>CNN</w:t>
       </w:r>
+      <w:r>
+        <w:rPr>
+          <w:rFonts w:hint="eastAsia"/>
+        </w:rPr>
+        <w:t>（</w:t>
+      </w:r>
+      <w:r>
+        <w:rPr>
+          <w:rFonts w:hint="eastAsia"/>
+        </w:rPr>
+        <w:t>卷积神经网络</w:t>
+      </w:r>
+      <w:r>
+        <w:rPr>
+          <w:rFonts w:hint="eastAsia"/>
+        </w:rPr>
+        <w:t>）</w:t>
+      </w:r>
+    </w:p>
+    <w:p>
+      <w:r>
+        <w:tab/>
+      </w:r>
+      <w:r>
+        <w:rPr>
+          <w:rFonts w:hint="eastAsia"/>
+        </w:rPr>
+        <w:t>比如在图像识别中，</w:t>
+      </w:r>
+      <w:r>
+        <w:rPr>
+          <w:rFonts w:hint="eastAsia"/>
+        </w:rPr>
+        <w:t>CNN</w:t>
+      </w:r>
+      <w:r>
+        <w:rPr>
+          <w:rFonts w:hint="eastAsia"/>
+        </w:rPr>
+        <w:t>会用一个个小的探测器（</w:t>
+      </w:r>
+      <w:r>
+        <w:rPr>
+          <w:rFonts w:hint="eastAsia"/>
+          <w:color w:val="EE0000"/>
+        </w:rPr>
+        <w:t>卷积核</w:t>
+      </w:r>
+      <w:r>
+        <w:rPr>
+          <w:rFonts w:hint="eastAsia"/>
+        </w:rPr>
+        <w:t>）在图像中移动，有的探测器专门负责找边缘，有的探测器专门找眼睛，有的探测器专门找毛发纹理。它每移动到一个地方就会打分，区分匹配度高低，这个过程就叫做</w:t>
+      </w:r>
+      <w:r>
+        <w:rPr>
+          <w:rFonts w:hint="eastAsia"/>
+          <w:color w:val="EE0000"/>
+        </w:rPr>
+        <w:t>卷积</w:t>
+      </w:r>
+      <w:r>
+        <w:rPr>
+          <w:rFonts w:hint="eastAsia"/>
+        </w:rPr>
+        <w:t>。即用小窗口扫描全局，去抓取局部特征。</w:t>
+      </w:r>
+      <w:r>
+        <w:t xml:space="preserve"> </w:t>
+      </w:r>
+    </w:p>
+    <w:p>
+      <w:pPr>
+        <w:rPr>
+          <w:rFonts w:hint="eastAsia"/>
+        </w:rPr>
+      </w:pPr>
+      <w:r>
+        <w:tab/>
+      </w:r>
+      <w:r>
+        <w:rPr>
+          <w:rFonts w:hint="eastAsia"/>
+        </w:rPr>
+        <w:t>卷积神经网络还有一个</w:t>
+      </w:r>
+      <w:r>
+        <w:rPr>
+          <w:rFonts w:hint="eastAsia"/>
+          <w:color w:val="EE0000"/>
+        </w:rPr>
+        <w:t>池化</w:t>
+      </w:r>
+      <w:r>
+        <w:rPr>
+          <w:rFonts w:hint="eastAsia"/>
+        </w:rPr>
+        <w:t>的概念，简单来说就是压缩照片，比如把像素矩阵</w:t>
+      </w:r>
+      <w:r>
+        <w:rPr>
+          <w:rFonts w:hint="eastAsia"/>
+        </w:rPr>
+        <w:t>4*4</w:t>
+      </w:r>
+      <w:r>
+        <w:rPr>
+          <w:rFonts w:hint="eastAsia"/>
+        </w:rPr>
+        <w:t>的缩小为</w:t>
+      </w:r>
+      <w:r>
+        <w:rPr>
+          <w:rFonts w:hint="eastAsia"/>
+        </w:rPr>
+        <w:t>1*1</w:t>
+      </w:r>
+      <w:r>
+        <w:rPr>
+          <w:rFonts w:hint="eastAsia"/>
+        </w:rPr>
+        <w:t>，只保留最亮的那一个格子，这样图片变小了计算快了，但是关键信息还在。</w:t>
+      </w:r>
+    </w:p>
+    <w:p>
+      <w:pPr>
+        <w:rPr>
+          <w:rFonts w:hint="eastAsia"/>
+        </w:rPr>
+      </w:pPr>
     </w:p>
     <w:p>
       <w:pPr>
@@ -2334,19 +3173,103 @@
         <w:rPr>
           <w:rFonts w:hint="eastAsia"/>
         </w:rPr>
-        <w:t>CNN(</w:t>
-      </w:r>
-      <w:r>
-        <w:rPr>
-          <w:rFonts w:hint="eastAsia"/>
-        </w:rPr>
-        <w:t>卷积神经网络</w:t>
-      </w:r>
-      <w:r>
-        <w:rPr>
-          <w:rFonts w:hint="eastAsia"/>
-        </w:rPr>
-        <w:t>)</w:t>
+        <w:t>卷积神经网络通常用来处理图像数据，假设输入数据的形状为</w:t>
+      </w:r>
+      <w:r>
+        <w:rPr>
+          <w:rFonts w:hint="eastAsia"/>
+        </w:rPr>
+        <w:t>28</w:t>
+      </w:r>
+      <w:r>
+        <w:rPr>
+          <w:rFonts w:hint="eastAsia"/>
+        </w:rPr>
+        <w:t>×</w:t>
+      </w:r>
+      <w:r>
+        <w:rPr>
+          <w:rFonts w:hint="eastAsia"/>
+        </w:rPr>
+        <w:t>28</w:t>
+      </w:r>
+      <w:r>
+        <w:rPr>
+          <w:rFonts w:hint="eastAsia"/>
+        </w:rPr>
+        <w:t>×</w:t>
+      </w:r>
+      <w:r>
+        <w:rPr>
+          <w:rFonts w:hint="eastAsia"/>
+        </w:rPr>
+        <w:t>3(28pixels</w:t>
+      </w:r>
+      <w:r>
+        <w:rPr>
+          <w:rFonts w:hint="eastAsia"/>
+        </w:rPr>
+        <w:t>×</w:t>
+      </w:r>
+      <w:r>
+        <w:rPr>
+          <w:rFonts w:hint="eastAsia"/>
+        </w:rPr>
+        <w:t>28pixels</w:t>
+      </w:r>
+      <w:r>
+        <w:rPr>
+          <w:rFonts w:hint="eastAsia"/>
+        </w:rPr>
+        <w:t>×</w:t>
+      </w:r>
+      <w:r>
+        <w:rPr>
+          <w:rFonts w:hint="eastAsia"/>
+        </w:rPr>
+        <w:t>RGB Value)</w:t>
+      </w:r>
+      <w:r>
+        <w:rPr>
+          <w:rFonts w:hint="eastAsia"/>
+        </w:rPr>
+        <w:t>，那么对于传统的神经网络来说就会有</w:t>
+      </w:r>
+      <w:r>
+        <w:rPr>
+          <w:rFonts w:hint="eastAsia"/>
+        </w:rPr>
+        <w:t>2352(28</w:t>
+      </w:r>
+      <w:r>
+        <w:rPr>
+          <w:rFonts w:hint="eastAsia"/>
+        </w:rPr>
+        <w:t>×</w:t>
+      </w:r>
+      <w:r>
+        <w:rPr>
+          <w:rFonts w:hint="eastAsia"/>
+        </w:rPr>
+        <w:t>28</w:t>
+      </w:r>
+      <w:r>
+        <w:rPr>
+          <w:rFonts w:hint="eastAsia"/>
+        </w:rPr>
+        <w:t>×</w:t>
+      </w:r>
+      <w:r>
+        <w:rPr>
+          <w:rFonts w:hint="eastAsia"/>
+        </w:rPr>
+        <w:t>3)</w:t>
+      </w:r>
+      <w:r>
+        <w:rPr>
+          <w:rFonts w:hint="eastAsia"/>
+        </w:rPr>
+        <w:t>个变量。随着图像尺寸的增加，那么变量的数量就会急剧增加。</w:t>
       </w:r>
     </w:p>
     <w:p>
@@ -2357,7 +3280,113 @@
         <w:rPr>
           <w:rFonts w:hint="eastAsia"/>
         </w:rPr>
-        <w:t>卷积神经网络通常用来处理图像数据，假设输入数据的形状为</w:t>
+        <w:t>因此，通过对图片进行卷积，可以减少变量的数目。随着过滤器沿着图像上宽和高的两个方向滑动，就会产生一个相应的</w:t>
+      </w:r>
+      <w:r>
+        <w:rPr>
+          <w:rFonts w:hint="eastAsia"/>
+        </w:rPr>
+        <w:t>2</w:t>
+      </w:r>
+      <w:r>
+        <w:rPr>
+          <w:rFonts w:hint="eastAsia"/>
+        </w:rPr>
+        <w:t>维激活映射，最后再沿纵向将所有的激活映射堆叠在一起，就产生了最后的输出。</w:t>
+      </w:r>
+    </w:p>
+    <w:p>
+      <w:pPr>
+        <w:pStyle w:val="3"/>
+      </w:pPr>
+      <w:r>
+        <w:rPr>
+          <w:rFonts w:hint="eastAsia"/>
+        </w:rPr>
+        <w:t>原理</w:t>
+      </w:r>
+    </w:p>
+    <w:p>
+      <w:pPr>
+        <w:pStyle w:val="4"/>
+      </w:pPr>
+      <w:r>
+        <w:rPr>
+          <w:rFonts w:hint="eastAsia"/>
+        </w:rPr>
+        <w:t>过滤器</w:t>
+      </w:r>
+      <w:r>
+        <w:rPr>
+          <w:rFonts w:hint="eastAsia"/>
+        </w:rPr>
+        <w:t>/</w:t>
+      </w:r>
+      <w:r>
+        <w:rPr>
+          <w:rFonts w:hint="eastAsia"/>
+        </w:rPr>
+        <w:t>滤波器</w:t>
+      </w:r>
+      <w:r>
+        <w:rPr>
+          <w:rFonts w:hint="eastAsia"/>
+        </w:rPr>
+        <w:t>(Filter)</w:t>
+      </w:r>
+    </w:p>
+    <w:p>
+      <w:pPr>
+        <w:ind w:firstLine="420"/>
+      </w:pPr>
+      <w:r>
+        <w:rPr>
+          <w:rFonts w:hint="eastAsia"/>
+        </w:rPr>
+        <w:t>CNN</w:t>
+      </w:r>
+      <w:r>
+        <w:rPr>
+          <w:rFonts w:hint="eastAsia"/>
+        </w:rPr>
+        <w:t>中的滤波器，具体是指将一个</w:t>
+      </w:r>
+      <w:r>
+        <w:rPr>
+          <w:rFonts w:hint="eastAsia"/>
+          <w:color w:val="FF0000"/>
+        </w:rPr>
+        <w:t>权重矩阵</w:t>
+      </w:r>
+      <w:r>
+        <w:rPr>
+          <w:rFonts w:hint="eastAsia"/>
+        </w:rPr>
+        <w:t>，我们用它乘以输入图像的一部分，产生相应的</w:t>
+      </w:r>
+      <w:r>
+        <w:rPr>
+          <w:rFonts w:hint="eastAsia"/>
+          <w:color w:val="EE0000"/>
+        </w:rPr>
+        <w:t>卷积输出</w:t>
+      </w:r>
+      <w:r>
+        <w:rPr>
+          <w:rFonts w:hint="eastAsia"/>
+        </w:rPr>
+        <w:t>。</w:t>
+      </w:r>
+    </w:p>
+    <w:p>
+      <w:pPr>
+        <w:ind w:firstLine="420"/>
+      </w:pPr>
+      <w:r>
+        <w:rPr>
+          <w:rFonts w:hint="eastAsia"/>
+        </w:rPr>
+        <w:t>比方说，对于一个</w:t>
       </w:r>
       <w:r>
         <w:rPr>
@@ -2381,13 +3410,37 @@
         <w:rPr>
           <w:rFonts w:hint="eastAsia"/>
         </w:rPr>
+        <w:t>的图片，将一个</w:t>
+      </w:r>
+      <w:r>
+        <w:rPr>
+          <w:rFonts w:hint="eastAsia"/>
+        </w:rPr>
+        <w:t>3</w:t>
+      </w:r>
+      <w:r>
+        <w:rPr>
+          <w:rFonts w:hint="eastAsia"/>
+        </w:rPr>
         <w:t>×</w:t>
       </w:r>
       <w:r>
         <w:rPr>
           <w:rFonts w:hint="eastAsia"/>
         </w:rPr>
-        <w:t>3(28pixels</w:t>
+        <w:t>3</w:t>
+      </w:r>
+      <w:r>
+        <w:rPr>
+          <w:rFonts w:hint="eastAsia"/>
+        </w:rPr>
+        <w:t>的滤波器与图片中</w:t>
+      </w:r>
+      <w:r>
+        <w:rPr>
+          <w:rFonts w:hint="eastAsia"/>
+        </w:rPr>
+        <w:t>3</w:t>
       </w:r>
       <w:r>
         <w:rPr>
@@ -2399,61 +3452,13 @@
         <w:rPr>
           <w:rFonts w:hint="eastAsia"/>
         </w:rPr>
-        <w:t>28pixels</w:t>
-      </w:r>
-      <w:r>
-        <w:rPr>
-          <w:rFonts w:hint="eastAsia"/>
-        </w:rPr>
-        <w:t>×</w:t>
-      </w:r>
-      <w:r>
-        <w:rPr>
-          <w:rFonts w:hint="eastAsia"/>
-        </w:rPr>
-        <w:t>RGB Value)</w:t>
-      </w:r>
-      <w:r>
-        <w:rPr>
-          <w:rFonts w:hint="eastAsia"/>
-        </w:rPr>
-        <w:t>，那么对于传统的神经网络来说就会有</w:t>
-      </w:r>
-      <w:r>
-        <w:rPr>
-          <w:rFonts w:hint="eastAsia"/>
-        </w:rPr>
-        <w:t>2352(28</w:t>
-      </w:r>
-      <w:r>
-        <w:rPr>
-          <w:rFonts w:hint="eastAsia"/>
-        </w:rPr>
-        <w:t>×</w:t>
-      </w:r>
-      <w:r>
-        <w:rPr>
-          <w:rFonts w:hint="eastAsia"/>
-        </w:rPr>
-        <w:t>28</w:t>
-      </w:r>
-      <w:r>
-        <w:rPr>
-          <w:rFonts w:hint="eastAsia"/>
-        </w:rPr>
-        <w:t>×</w:t>
-      </w:r>
-      <w:r>
-        <w:rPr>
-          <w:rFonts w:hint="eastAsia"/>
-        </w:rPr>
-        <w:t>3)</w:t>
-      </w:r>
-      <w:r>
-        <w:rPr>
-          <w:rFonts w:hint="eastAsia"/>
-        </w:rPr>
-        <w:t>个变量。随着图像尺寸的增加，那么变量的数量就会急剧增加。</w:t>
+        <w:t>3</w:t>
+      </w:r>
+      <w:r>
+        <w:rPr>
+          <w:rFonts w:hint="eastAsia"/>
+        </w:rPr>
+        <w:t>的矩阵依次相乘，从而得到相应的卷积输出。滤波器的尺寸通常比原始图片要小，与权重相似，在最小化成本的反向传播中，滤波器也会被更新。</w:t>
       </w:r>
     </w:p>
     <w:p>
@@ -2462,173 +3467,9 @@
       </w:pPr>
       <w:r>
         <w:rPr>
-          <w:rFonts w:hint="eastAsia"/>
-        </w:rPr>
-        <w:t>因此，通过对图片进行卷积，可以减少变量的数目。随着过滤器沿着图像上宽和高的两个方向滑动，就会产生一个相应的</w:t>
-      </w:r>
-      <w:r>
-        <w:rPr>
-          <w:rFonts w:hint="eastAsia"/>
-        </w:rPr>
-        <w:t>2</w:t>
-      </w:r>
-      <w:r>
-        <w:rPr>
-          <w:rFonts w:hint="eastAsia"/>
-        </w:rPr>
-        <w:t>维激活映射，最后再沿纵向将所有的激活映射堆叠在一起，就产生了最后的输出。</w:t>
-      </w:r>
-    </w:p>
-    <w:p>
-      <w:pPr>
-        <w:pStyle w:val="3"/>
-      </w:pPr>
-      <w:r>
-        <w:rPr>
-          <w:rFonts w:hint="eastAsia"/>
-        </w:rPr>
-        <w:t>过滤器</w:t>
-      </w:r>
-      <w:r>
-        <w:rPr>
-          <w:rFonts w:hint="eastAsia"/>
-        </w:rPr>
-        <w:t>/</w:t>
-      </w:r>
-      <w:r>
-        <w:rPr>
-          <w:rFonts w:hint="eastAsia"/>
-        </w:rPr>
-        <w:t>滤波器</w:t>
-      </w:r>
-      <w:r>
-        <w:rPr>
-          <w:rFonts w:hint="eastAsia"/>
-        </w:rPr>
-        <w:t>(Filter)</w:t>
-      </w:r>
-    </w:p>
-    <w:p>
-      <w:pPr>
-        <w:ind w:firstLine="420"/>
-      </w:pPr>
-      <w:r>
-        <w:rPr>
-          <w:rFonts w:hint="eastAsia"/>
-        </w:rPr>
-        <w:t>CNN</w:t>
-      </w:r>
-      <w:r>
-        <w:rPr>
-          <w:rFonts w:hint="eastAsia"/>
-        </w:rPr>
-        <w:t>中的滤波器，具体是指将一个</w:t>
-      </w:r>
-      <w:r>
-        <w:rPr>
-          <w:rFonts w:hint="eastAsia"/>
-          <w:color w:val="FF0000"/>
-        </w:rPr>
-        <w:t>权重矩阵</w:t>
-      </w:r>
-      <w:r>
-        <w:rPr>
-          <w:rFonts w:hint="eastAsia"/>
-        </w:rPr>
-        <w:t>，我们用它乘以输入图像的一部分，产生相应的卷积输出。</w:t>
-      </w:r>
-    </w:p>
-    <w:p>
-      <w:pPr>
-        <w:ind w:firstLine="420"/>
-      </w:pPr>
-      <w:r>
-        <w:rPr>
-          <w:rFonts w:hint="eastAsia"/>
-        </w:rPr>
-        <w:t>比方说，对于一个</w:t>
-      </w:r>
-      <w:r>
-        <w:rPr>
-          <w:rFonts w:hint="eastAsia"/>
-        </w:rPr>
-        <w:t>28</w:t>
-      </w:r>
-      <w:r>
-        <w:rPr>
-          <w:rFonts w:hint="eastAsia"/>
-        </w:rPr>
-        <w:t>×</w:t>
-      </w:r>
-      <w:r>
-        <w:rPr>
-          <w:rFonts w:hint="eastAsia"/>
-        </w:rPr>
-        <w:t>28</w:t>
-      </w:r>
-      <w:r>
-        <w:rPr>
-          <w:rFonts w:hint="eastAsia"/>
-        </w:rPr>
-        <w:t>的图片，将一个</w:t>
-      </w:r>
-      <w:r>
-        <w:rPr>
-          <w:rFonts w:hint="eastAsia"/>
-        </w:rPr>
-        <w:t>3</w:t>
-      </w:r>
-      <w:r>
-        <w:rPr>
-          <w:rFonts w:hint="eastAsia"/>
-        </w:rPr>
-        <w:t>×</w:t>
-      </w:r>
-      <w:r>
-        <w:rPr>
-          <w:rFonts w:hint="eastAsia"/>
-        </w:rPr>
-        <w:t>3</w:t>
-      </w:r>
-      <w:r>
-        <w:rPr>
-          <w:rFonts w:hint="eastAsia"/>
-        </w:rPr>
-        <w:t>的滤波器与图片中</w:t>
-      </w:r>
-      <w:r>
-        <w:rPr>
-          <w:rFonts w:hint="eastAsia"/>
-        </w:rPr>
-        <w:t>3</w:t>
-      </w:r>
-      <w:r>
-        <w:rPr>
-          <w:rFonts w:hint="eastAsia"/>
-        </w:rPr>
-        <w:t>×</w:t>
-      </w:r>
-      <w:r>
-        <w:rPr>
-          <w:rFonts w:hint="eastAsia"/>
-        </w:rPr>
-        <w:t>3</w:t>
-      </w:r>
-      <w:r>
-        <w:rPr>
-          <w:rFonts w:hint="eastAsia"/>
-        </w:rPr>
-        <w:t>的矩阵依次相乘，从而得到相应的卷积输出。滤波器的尺寸通常比原始图片要小，与权重相似，在最小化成本的反向传播中，滤波器也会被更新。</w:t>
-      </w:r>
-    </w:p>
-    <w:p>
-      <w:pPr>
-        <w:ind w:firstLine="420"/>
-      </w:pPr>
-      <w:r>
-        <w:rPr>
           <w:noProof/>
         </w:rPr>
+        <w:lastRenderedPageBreak/>
         <w:drawing>
           <wp:anchor distT="0" distB="0" distL="114300" distR="114300" simplePos="0" relativeHeight="251702272" behindDoc="0" locked="0" layoutInCell="1" allowOverlap="1" wp14:anchorId="083A3D61" wp14:editId="3D5177FF">
             <wp:simplePos x="0" y="0"/>
@@ -2653,7 +3494,7 @@
                     <pic:cNvPicPr/>
                   </pic:nvPicPr>
                   <pic:blipFill>
-                    <a:blip r:embed="rId15"/>
+                    <a:blip r:embed="rId20"/>
                     <a:stretch>
                       <a:fillRect/>
                     </a:stretch>
@@ -2707,19 +3548,12 @@
         <w:rPr>
           <w:rFonts w:hint="eastAsia"/>
         </w:rPr>
-        <w:t>的分</w:t>
-      </w:r>
-      <w:r>
-        <w:rPr>
-          <w:rFonts w:hint="eastAsia"/>
-        </w:rPr>
-        <w:lastRenderedPageBreak/>
-        <w:t>块，从而产生卷积的结果。</w:t>
-      </w:r>
-    </w:p>
-    <w:p>
-      <w:pPr>
-        <w:pStyle w:val="3"/>
+        <w:t>的分块，从而产生卷积的结果。</w:t>
+      </w:r>
+    </w:p>
+    <w:p>
+      <w:pPr>
+        <w:pStyle w:val="4"/>
       </w:pPr>
       <w:r>
         <w:rPr>
@@ -2742,11 +3576,19 @@
         <w:rPr>
           <w:rFonts w:hint="eastAsia"/>
         </w:rPr>
-        <w:t>为了进一步减少变量的数目同时防止过拟合，一种常见的做法是在卷积层中引入池化层</w:t>
-      </w:r>
-      <w:r>
-        <w:rPr>
-          <w:rFonts w:hint="eastAsia"/>
+        <w:t>为了进一步减少变量的数目同时防止过拟合，一种常见的做法是在卷积层中引入</w:t>
+      </w:r>
+      <w:r>
+        <w:rPr>
+          <w:rFonts w:hint="eastAsia"/>
+          <w:color w:val="EE0000"/>
+        </w:rPr>
+        <w:t>池化层</w:t>
+      </w:r>
+      <w:r>
+        <w:rPr>
+          <w:rFonts w:hint="eastAsia"/>
+          <w:color w:val="EE0000"/>
         </w:rPr>
         <w:t>(pooling layer)</w:t>
       </w:r>
@@ -2822,7 +3664,7 @@
                     <pic:cNvPicPr/>
                   </pic:nvPicPr>
                   <pic:blipFill>
-                    <a:blip r:embed="rId16"/>
+                    <a:blip r:embed="rId21"/>
                     <a:stretch>
                       <a:fillRect/>
                     </a:stretch>
@@ -2872,12 +3714,13 @@
     </w:p>
     <w:p>
       <w:pPr>
-        <w:pStyle w:val="3"/>
-      </w:pPr>
-      <w:r>
-        <w:rPr>
-          <w:rFonts w:hint="eastAsia"/>
-        </w:rPr>
+        <w:pStyle w:val="4"/>
+      </w:pPr>
+      <w:r>
+        <w:rPr>
+          <w:rFonts w:hint="eastAsia"/>
+        </w:rPr>
+        <w:lastRenderedPageBreak/>
         <w:t>补白</w:t>
       </w:r>
       <w:r>
@@ -2919,7 +3762,7 @@
                     <pic:cNvPicPr/>
                   </pic:nvPicPr>
                   <pic:blipFill>
-                    <a:blip r:embed="rId17"/>
+                    <a:blip r:embed="rId22"/>
                     <a:stretch>
                       <a:fillRect/>
                     </a:stretch>
@@ -3103,7 +3946,7 @@
     </w:p>
     <w:p>
       <w:pPr>
-        <w:pStyle w:val="3"/>
+        <w:pStyle w:val="4"/>
       </w:pPr>
       <w:r>
         <w:rPr>
@@ -3149,7 +3992,6 @@
         <w:rPr>
           <w:noProof/>
         </w:rPr>
-        <w:lastRenderedPageBreak/>
         <w:drawing>
           <wp:anchor distT="0" distB="0" distL="114300" distR="114300" simplePos="0" relativeHeight="251705344" behindDoc="0" locked="0" layoutInCell="1" allowOverlap="1" wp14:anchorId="7189B27B" wp14:editId="4A911D15">
             <wp:simplePos x="0" y="0"/>
@@ -3174,7 +4016,7 @@
                     <pic:cNvPicPr/>
                   </pic:nvPicPr>
                   <pic:blipFill>
-                    <a:blip r:embed="rId18"/>
+                    <a:blip r:embed="rId23"/>
                     <a:stretch>
                       <a:fillRect/>
                     </a:stretch>
@@ -3209,31 +4051,114 @@
     </w:p>
     <w:p>
       <w:pPr>
+        <w:pStyle w:val="4"/>
+      </w:pPr>
+      <w:r>
+        <w:rPr>
+          <w:rFonts w:hint="eastAsia"/>
+        </w:rPr>
+        <w:t>CNN(</w:t>
+      </w:r>
+      <w:r>
+        <w:rPr>
+          <w:rFonts w:hint="eastAsia"/>
+        </w:rPr>
+        <w:t>卷积神经网络</w:t>
+      </w:r>
+      <w:r>
+        <w:rPr>
+          <w:rFonts w:hint="eastAsia"/>
+        </w:rPr>
+        <w:t>)</w:t>
+      </w:r>
+    </w:p>
+    <w:p>
+      <w:pPr>
         <w:pStyle w:val="3"/>
       </w:pPr>
       <w:r>
         <w:rPr>
           <w:rFonts w:hint="eastAsia"/>
         </w:rPr>
-        <w:t>CNN(</w:t>
-      </w:r>
-      <w:r>
-        <w:rPr>
-          <w:rFonts w:hint="eastAsia"/>
-        </w:rPr>
-        <w:t>卷积神经网络</w:t>
-      </w:r>
-      <w:r>
-        <w:rPr>
-          <w:rFonts w:hint="eastAsia"/>
-        </w:rPr>
-        <w:t>)</w:t>
-      </w:r>
-    </w:p>
-    <w:p>
-      <w:pPr>
-        <w:ind w:firstLine="420"/>
-      </w:pPr>
+        <w:t>特点</w:t>
+      </w:r>
+    </w:p>
+    <w:p>
+      <w:pPr>
+        <w:pStyle w:val="4"/>
+      </w:pPr>
+      <w:r>
+        <w:rPr>
+          <w:rFonts w:hint="eastAsia"/>
+        </w:rPr>
+        <w:t>优点</w:t>
+      </w:r>
+    </w:p>
+    <w:p>
+      <w:pPr>
+        <w:pStyle w:val="4"/>
+      </w:pPr>
+      <w:r>
+        <w:rPr>
+          <w:rFonts w:hint="eastAsia"/>
+        </w:rPr>
+        <w:t>缺点</w:t>
+      </w:r>
+    </w:p>
+    <w:p>
+      <w:pPr>
+        <w:rPr>
+          <w:rFonts w:hint="eastAsia"/>
+        </w:rPr>
+      </w:pPr>
+      <w:r>
+        <w:tab/>
+      </w:r>
+      <w:r>
+        <w:rPr>
+          <w:rFonts w:hint="eastAsia"/>
+        </w:rPr>
+        <w:t>卷积神经网络看不懂文字。因为文字不是局部特征的组合，二是</w:t>
+      </w:r>
+      <w:r>
+        <w:rPr>
+          <w:rFonts w:hint="eastAsia"/>
+          <w:color w:val="EE0000"/>
+        </w:rPr>
+        <w:t>顺序决定意义</w:t>
+      </w:r>
+      <w:r>
+        <w:rPr>
+          <w:rFonts w:hint="eastAsia"/>
+        </w:rPr>
+        <w:t>。</w:t>
+      </w:r>
+    </w:p>
+    <w:p>
+      <w:pPr>
+        <w:pStyle w:val="3"/>
+      </w:pPr>
+      <w:r>
+        <w:rPr>
+          <w:rFonts w:hint="eastAsia"/>
+        </w:rPr>
+        <w:lastRenderedPageBreak/>
+        <w:t>算法</w:t>
+      </w:r>
+    </w:p>
+    <w:p>
+      <w:pPr>
+        <w:pStyle w:val="4"/>
+        <w:rPr>
+          <w:rFonts w:hint="eastAsia"/>
+        </w:rPr>
+      </w:pPr>
+      <w:r>
+        <w:rPr>
+          <w:rFonts w:hint="eastAsia"/>
+        </w:rPr>
+        <w:t>AlexNet</w:t>
+      </w:r>
     </w:p>
     <w:p>
       <w:pPr>
@@ -3245,6 +4170,223 @@
         </w:rPr>
         <w:t>RNN</w:t>
       </w:r>
+      <w:r>
+        <w:rPr>
+          <w:rFonts w:hint="eastAsia"/>
+        </w:rPr>
+        <w:t>（</w:t>
+      </w:r>
+      <w:r>
+        <w:t>Recurrent Neural Network</w:t>
+      </w:r>
+      <w:r>
+        <w:rPr>
+          <w:rFonts w:hint="eastAsia"/>
+        </w:rPr>
+        <w:t>）</w:t>
+      </w:r>
+    </w:p>
+    <w:p>
+      <w:r>
+        <w:tab/>
+      </w:r>
+      <w:r>
+        <w:rPr>
+          <w:rFonts w:hint="eastAsia"/>
+        </w:rPr>
+        <w:t>由于</w:t>
+      </w:r>
+      <w:r>
+        <w:rPr>
+          <w:rFonts w:hint="eastAsia"/>
+        </w:rPr>
+        <w:t>CNN</w:t>
+      </w:r>
+      <w:r>
+        <w:rPr>
+          <w:rFonts w:hint="eastAsia"/>
+        </w:rPr>
+        <w:t>没有办法处理序列问题，因此引入了循环神经网络</w:t>
+      </w:r>
+      <w:r>
+        <w:rPr>
+          <w:rFonts w:hint="eastAsia"/>
+        </w:rPr>
+        <w:t>RNN</w:t>
+      </w:r>
+      <w:r>
+        <w:rPr>
+          <w:rFonts w:hint="eastAsia"/>
+        </w:rPr>
+        <w:t>。可以这么理解，</w:t>
+      </w:r>
+      <w:r>
+        <w:rPr>
+          <w:rFonts w:hint="eastAsia"/>
+        </w:rPr>
+        <w:t>RNN</w:t>
+      </w:r>
+      <w:r>
+        <w:rPr>
+          <w:rFonts w:hint="eastAsia"/>
+        </w:rPr>
+        <w:t>类似人一样，一边读一边记笔记，这个“笔记”的学名叫做</w:t>
+      </w:r>
+      <w:r>
+        <w:rPr>
+          <w:rFonts w:hint="eastAsia"/>
+          <w:color w:val="EE0000"/>
+        </w:rPr>
+        <w:t>隐藏状态</w:t>
+      </w:r>
+      <w:r>
+        <w:rPr>
+          <w:rFonts w:hint="eastAsia"/>
+        </w:rPr>
+        <w:t>。</w:t>
+      </w:r>
+      <w:r>
+        <w:rPr>
+          <w:rFonts w:hint="eastAsia"/>
+        </w:rPr>
+        <w:t>RNN</w:t>
+      </w:r>
+      <w:r>
+        <w:rPr>
+          <w:rFonts w:hint="eastAsia"/>
+        </w:rPr>
+        <w:t>在处理文本时，它会按照词的顺序一个一个算，每处理一个词就把这个词存到隐藏状态里。</w:t>
+      </w:r>
+      <w:r>
+        <w:rPr>
+          <w:rFonts w:hint="eastAsia"/>
+        </w:rPr>
+        <w:t>下一个词的计算，必须用到这个隐藏状态。</w:t>
+      </w:r>
+      <w:r>
+        <w:rPr>
+          <w:rFonts w:hint="eastAsia"/>
+        </w:rPr>
+        <w:t>因此</w:t>
+      </w:r>
+      <w:r>
+        <w:rPr>
+          <w:rFonts w:hint="eastAsia"/>
+        </w:rPr>
+        <w:t>RNN</w:t>
+      </w:r>
+      <w:r>
+        <w:rPr>
+          <w:rFonts w:hint="eastAsia"/>
+        </w:rPr>
+        <w:t>可以做翻译、写摘要、判断情感等。</w:t>
+      </w:r>
+    </w:p>
+    <w:p>
+      <w:r>
+        <w:tab/>
+      </w:r>
+      <w:r>
+        <w:rPr>
+          <w:rFonts w:hint="eastAsia"/>
+        </w:rPr>
+        <w:t>但是</w:t>
+      </w:r>
+      <w:r>
+        <w:rPr>
+          <w:rFonts w:hint="eastAsia"/>
+        </w:rPr>
+        <w:t>RNN</w:t>
+      </w:r>
+      <w:r>
+        <w:rPr>
+          <w:rFonts w:hint="eastAsia"/>
+        </w:rPr>
+        <w:t>也存在一些问题：</w:t>
+      </w:r>
+    </w:p>
+    <w:p>
+      <w:pPr>
+        <w:pStyle w:val="a5"/>
+        <w:numPr>
+          <w:ilvl w:val="0"/>
+          <w:numId w:val="1"/>
+        </w:numPr>
+        <w:ind w:firstLineChars="0"/>
+      </w:pPr>
+      <w:r>
+        <w:rPr>
+          <w:rFonts w:hint="eastAsia"/>
+        </w:rPr>
+        <w:t>太慢，无法并行</w:t>
+      </w:r>
+    </w:p>
+    <w:p>
+      <w:pPr>
+        <w:pStyle w:val="a5"/>
+        <w:numPr>
+          <w:ilvl w:val="0"/>
+          <w:numId w:val="1"/>
+        </w:numPr>
+        <w:ind w:firstLineChars="0"/>
+      </w:pPr>
+      <w:r>
+        <w:rPr>
+          <w:rFonts w:hint="eastAsia"/>
+        </w:rPr>
+        <w:t>记性差，太长的句子无法很好支持</w:t>
+      </w:r>
+      <w:r>
+        <w:rPr>
+          <w:rFonts w:hint="eastAsia"/>
+        </w:rPr>
+        <w:t>，即</w:t>
+      </w:r>
+      <w:r>
+        <w:rPr>
+          <w:rFonts w:hint="eastAsia"/>
+          <w:color w:val="EE0000"/>
+        </w:rPr>
+        <w:t>长距离依赖问题</w:t>
+      </w:r>
+    </w:p>
+    <w:p>
+      <w:pPr>
+        <w:ind w:left="420"/>
+        <w:rPr>
+          <w:rFonts w:hint="eastAsia"/>
+        </w:rPr>
+      </w:pPr>
+      <w:r>
+        <w:rPr>
+          <w:rFonts w:hint="eastAsia"/>
+        </w:rPr>
+        <w:t>为了解决上述的问题，提出了</w:t>
+      </w:r>
+      <w:r>
+        <w:rPr>
+          <w:rFonts w:hint="eastAsia"/>
+        </w:rPr>
+        <w:t>Transformer</w:t>
+      </w:r>
+      <w:r>
+        <w:rPr>
+          <w:rFonts w:hint="eastAsia"/>
+        </w:rPr>
+        <w:t>机制</w:t>
+      </w:r>
+      <w:r>
+        <w:rPr>
+          <w:rFonts w:hint="eastAsia"/>
+        </w:rPr>
+        <w:t>（注意力机制）</w:t>
+      </w:r>
+      <w:r>
+        <w:rPr>
+          <w:rFonts w:hint="eastAsia"/>
+        </w:rPr>
+        <w:t>。</w:t>
+      </w:r>
     </w:p>
     <w:p>
       <w:pPr>
@@ -3254,15 +4396,18 @@
         <w:rPr>
           <w:rFonts w:hint="eastAsia"/>
         </w:rPr>
+        <w:t>原理</w:t>
+      </w:r>
+    </w:p>
+    <w:p>
+      <w:pPr>
+        <w:pStyle w:val="4"/>
+      </w:pPr>
+      <w:r>
+        <w:rPr>
+          <w:rFonts w:hint="eastAsia"/>
+        </w:rPr>
         <w:t>递归神经元</w:t>
-      </w:r>
-    </w:p>
-    <w:p>
-      <w:r>
-        <w:tab/>
-      </w:r>
-      <w:r>
-        <w:t>(Recurrent Neural Network)</w:t>
       </w:r>
     </w:p>
     <w:p>
@@ -3297,7 +4442,7 @@
                     <pic:cNvPicPr/>
                   </pic:nvPicPr>
                   <pic:blipFill>
-                    <a:blip r:embed="rId19"/>
+                    <a:blip r:embed="rId24"/>
                     <a:stretch>
                       <a:fillRect/>
                     </a:stretch>
@@ -3356,13 +4501,237 @@
     </w:p>
     <w:p>
       <w:pPr>
+        <w:pStyle w:val="4"/>
+      </w:pPr>
+      <w:r>
+        <w:rPr>
+          <w:rFonts w:hint="eastAsia"/>
+        </w:rPr>
+        <w:t>递归神经网络</w:t>
+      </w:r>
+    </w:p>
+    <w:p>
+      <w:r>
+        <w:tab/>
+      </w:r>
+      <w:r>
+        <w:t>(RNN-Recurrent Neural Network)</w:t>
+      </w:r>
+    </w:p>
+    <w:p>
+      <w:pPr>
+        <w:ind w:firstLine="420"/>
+      </w:pPr>
+      <w:r>
+        <w:rPr>
+          <w:rFonts w:hint="eastAsia"/>
+        </w:rPr>
+        <w:t>递归神经网络通常被用于处理序列化的数据，即前一项的输出是用来预测下一项的</w:t>
+      </w:r>
+      <w:r>
+        <w:rPr>
+          <w:rFonts w:hint="eastAsia"/>
+        </w:rPr>
+        <w:t xml:space="preserve"> </w:t>
+      </w:r>
+      <w:r>
+        <w:rPr>
+          <w:rFonts w:hint="eastAsia"/>
+        </w:rPr>
+        <w:t>。</w:t>
+      </w:r>
+    </w:p>
+    <w:p>
+      <w:pPr>
+        <w:ind w:firstLine="420"/>
+      </w:pPr>
+      <w:r>
+        <w:rPr>
+          <w:rFonts w:hint="eastAsia"/>
+        </w:rPr>
+        <w:t>递归神经网络中存在环的结构，这些神经元上的环状结构使得它们能够存储之前的数据一段时间，从而使得能够预测输出。</w:t>
+      </w:r>
+    </w:p>
+    <w:p>
+      <w:pPr>
+        <w:ind w:firstLine="420"/>
+      </w:pPr>
+      <w:r>
+        <w:rPr>
+          <w:rFonts w:hint="eastAsia"/>
+        </w:rPr>
+        <w:t>与递归神经元相似，在</w:t>
+      </w:r>
+      <w:r>
+        <w:rPr>
+          <w:rFonts w:hint="eastAsia"/>
+        </w:rPr>
+        <w:t>RNN</w:t>
+      </w:r>
+      <w:r>
+        <w:rPr>
+          <w:rFonts w:hint="eastAsia"/>
+        </w:rPr>
+        <w:t>中隐藏层的输出会作为下一次的输入，如此往复经历</w:t>
+      </w:r>
+      <w:r>
+        <w:rPr>
+          <w:rFonts w:hint="eastAsia"/>
+        </w:rPr>
+        <w:t>t</w:t>
+      </w:r>
+      <w:r>
+        <w:rPr>
+          <w:rFonts w:hint="eastAsia"/>
+        </w:rPr>
+        <w:t>次，再将输出的结果传递到下一层网络中。这样，最终输出的结果会更</w:t>
+      </w:r>
+      <w:r>
+        <w:rPr>
+          <w:rFonts w:hint="eastAsia"/>
+        </w:rPr>
+        <w:lastRenderedPageBreak/>
+        <w:t>全面，而且之前训练的信息被保持的时间会更久。</w:t>
+      </w:r>
+    </w:p>
+    <w:p>
+      <w:pPr>
+        <w:pStyle w:val="4"/>
+      </w:pPr>
+      <w:r>
+        <w:rPr>
+          <w:rFonts w:hint="eastAsia"/>
+        </w:rPr>
+        <w:t>梯度消失问题</w:t>
+      </w:r>
+    </w:p>
+    <w:p>
+      <w:pPr>
+        <w:ind w:firstLine="420"/>
+      </w:pPr>
+      <w:r>
+        <w:rPr>
+          <w:rFonts w:hint="eastAsia"/>
+        </w:rPr>
+        <w:t>当激活函数的梯度很小时就会发生梯度消失问题。在反向传播的过程中，权重因子会被多次乘以这些小的梯度，因此会越变越小，随着递归的深入趋于“消失”，使得神经网络失去了长程可靠性。这在递归神经网络中是一个较普遍的问题。</w:t>
+      </w:r>
+    </w:p>
+    <w:p>
+      <w:pPr>
+        <w:pStyle w:val="4"/>
+      </w:pPr>
+      <w:r>
+        <w:rPr>
+          <w:rFonts w:hint="eastAsia"/>
+        </w:rPr>
+        <w:t>梯度爆炸问题</w:t>
+      </w:r>
+    </w:p>
+    <w:p>
+      <w:pPr>
+        <w:ind w:firstLine="420"/>
+      </w:pPr>
+      <w:r>
+        <w:rPr>
+          <w:rFonts w:hint="eastAsia"/>
+        </w:rPr>
+        <w:t>与梯度消失问题对应，当激活函数的梯度较大时，就会发生梯度爆炸问题。在反向传播的过程中，部分节点的大梯度使得他们的权重变得非常大，从而削弱了其他节点对于结果的影响，这个问题可以通过截断</w:t>
+      </w:r>
+      <w:r>
+        <w:rPr>
+          <w:rFonts w:hint="eastAsia"/>
+        </w:rPr>
+        <w:t>(</w:t>
+      </w:r>
+      <w:r>
+        <w:rPr>
+          <w:rFonts w:hint="eastAsia"/>
+        </w:rPr>
+        <w:t>即设置一个梯度允许的最大值</w:t>
+      </w:r>
+      <w:r>
+        <w:rPr>
+          <w:rFonts w:hint="eastAsia"/>
+        </w:rPr>
+        <w:t>)</w:t>
+      </w:r>
+      <w:r>
+        <w:rPr>
+          <w:rFonts w:hint="eastAsia"/>
+        </w:rPr>
+        <w:t>的方式来有效避免。</w:t>
+      </w:r>
+    </w:p>
+    <w:p>
+      <w:pPr>
         <w:pStyle w:val="3"/>
       </w:pPr>
       <w:r>
         <w:rPr>
           <w:rFonts w:hint="eastAsia"/>
         </w:rPr>
-        <w:t>递归神经网络</w:t>
+        <w:t>特点</w:t>
+      </w:r>
+    </w:p>
+    <w:p>
+      <w:pPr>
+        <w:pStyle w:val="4"/>
+      </w:pPr>
+      <w:r>
+        <w:rPr>
+          <w:rFonts w:hint="eastAsia"/>
+        </w:rPr>
+        <w:t>优点</w:t>
+      </w:r>
+    </w:p>
+    <w:p>
+      <w:pPr>
+        <w:pStyle w:val="4"/>
+        <w:rPr>
+          <w:rFonts w:hint="eastAsia"/>
+        </w:rPr>
+      </w:pPr>
+      <w:r>
+        <w:rPr>
+          <w:rFonts w:hint="eastAsia"/>
+        </w:rPr>
+        <w:t>缺点</w:t>
+      </w:r>
+    </w:p>
+    <w:p>
+      <w:pPr>
+        <w:pStyle w:val="3"/>
+        <w:rPr>
+          <w:rFonts w:hint="eastAsia"/>
+        </w:rPr>
+      </w:pPr>
+      <w:r>
+        <w:rPr>
+          <w:rFonts w:hint="eastAsia"/>
+        </w:rPr>
+        <w:t>算法</w:t>
+      </w:r>
+    </w:p>
+    <w:p>
+      <w:pPr>
+        <w:pStyle w:val="2"/>
+      </w:pPr>
+      <w:r>
+        <w:rPr>
+          <w:rFonts w:hint="eastAsia"/>
+        </w:rPr>
+        <w:t>LSTM</w:t>
+      </w:r>
+    </w:p>
+    <w:p>
+      <w:pPr>
+        <w:pStyle w:val="2"/>
+      </w:pPr>
+      <w:r>
+        <w:rPr>
+          <w:rFonts w:hint="eastAsia"/>
+        </w:rPr>
+        <w:t>Transformer</w:t>
       </w:r>
     </w:p>
     <w:p>
@@ -3370,7 +4739,356 @@
         <w:tab/>
       </w:r>
       <w:r>
-        <w:t>(RNN-Recurrent Neural Network)</w:t>
+        <w:rPr>
+          <w:rFonts w:hint="eastAsia"/>
+        </w:rPr>
+        <w:t>RNN</w:t>
+      </w:r>
+      <w:r>
+        <w:rPr>
+          <w:rFonts w:hint="eastAsia"/>
+        </w:rPr>
+        <w:t>虽然有文本记忆的功能，但是速度很慢，无法并行，且存在长文本依赖问题，因此提出了并行计算</w:t>
+      </w:r>
+      <w:r>
+        <w:rPr>
+          <w:rFonts w:hint="eastAsia"/>
+        </w:rPr>
+        <w:t>+</w:t>
+      </w:r>
+      <w:r>
+        <w:rPr>
+          <w:rFonts w:hint="eastAsia"/>
+        </w:rPr>
+        <w:t>注意力依赖的</w:t>
+      </w:r>
+      <w:r>
+        <w:rPr>
+          <w:rFonts w:hint="eastAsia"/>
+        </w:rPr>
+        <w:t>Transformer</w:t>
+      </w:r>
+      <w:r>
+        <w:rPr>
+          <w:rFonts w:hint="eastAsia"/>
+        </w:rPr>
+        <w:t>架构。</w:t>
+      </w:r>
+    </w:p>
+    <w:p>
+      <w:r>
+        <w:tab/>
+      </w:r>
+      <w:r>
+        <w:rPr>
+          <w:rFonts w:hint="eastAsia"/>
+        </w:rPr>
+        <w:t>注意力机制就是抓重点（类似人看图片的时候眼球会抓重点），</w:t>
+      </w:r>
+      <w:r>
+        <w:rPr>
+          <w:rFonts w:hint="eastAsia"/>
+        </w:rPr>
+        <w:t>能够给更重要的词更高的关注度的权重，比如“我爱中国，你呢”这句话，在翻译“爱”这个词的时候，注意力会先计算“爱”和其他词的关联度。比如“爱”和“我”相关吗？结果：相关，主谓关系，这个打分就是高分。“爱”和“中国”相关吗？结果：相关，动宾关系</w:t>
+      </w:r>
+      <w:r>
+        <w:rPr>
+          <w:rFonts w:hint="eastAsia"/>
+        </w:rPr>
+        <w:t>，这个打分也是高分</w:t>
+      </w:r>
+      <w:r>
+        <w:rPr>
+          <w:rFonts w:hint="eastAsia"/>
+        </w:rPr>
+        <w:t>。</w:t>
+      </w:r>
+      <w:r>
+        <w:rPr>
+          <w:rFonts w:hint="eastAsia"/>
+        </w:rPr>
+        <w:t>“爱”和“你呢”相关吗？结果：没啥直接关系。这样，机器在翻译“我爱中国，你呢”这句话的时候，就会重点关注“我”和“中国”，然后给其他无关的词语权重就更小。</w:t>
+      </w:r>
+    </w:p>
+    <w:p>
+      <w:r>
+        <w:tab/>
+      </w:r>
+      <w:r>
+        <w:rPr>
+          <w:rFonts w:hint="eastAsia"/>
+        </w:rPr>
+        <w:t>注意力机制还支持并行计算，比如处理“我爱中国”这四个词，它能一次性算出“我”和“爱中国”的关联度，“爱”和“我中国”的关联度，以及“中国”和“我爱”的关联度，它不用等前一个词算完，这就好像从单窗口办事变成多窗</w:t>
+      </w:r>
+      <w:r>
+        <w:rPr>
+          <w:rFonts w:hint="eastAsia"/>
+        </w:rPr>
+        <w:lastRenderedPageBreak/>
+        <w:t>口</w:t>
+      </w:r>
+      <w:r>
+        <w:rPr>
+          <w:rFonts w:hint="eastAsia"/>
+        </w:rPr>
+        <w:t>同时办公。</w:t>
+      </w:r>
+      <w:r>
+        <w:rPr>
+          <w:rFonts w:hint="eastAsia"/>
+        </w:rPr>
+        <w:t>此时，</w:t>
+      </w:r>
+      <w:r>
+        <w:rPr>
+          <w:rFonts w:hint="eastAsia"/>
+        </w:rPr>
+        <w:t>RNN</w:t>
+      </w:r>
+      <w:r>
+        <w:rPr>
+          <w:rFonts w:hint="eastAsia"/>
+        </w:rPr>
+        <w:t>无法并行的问题被很好的解决了。</w:t>
+      </w:r>
+    </w:p>
+    <w:p>
+      <w:r>
+        <w:tab/>
+      </w:r>
+      <w:r>
+        <w:rPr>
+          <w:rFonts w:hint="eastAsia"/>
+        </w:rPr>
+        <w:t>那么又有一个问题：</w:t>
+      </w:r>
+      <w:r>
+        <w:rPr>
+          <w:rFonts w:hint="eastAsia"/>
+        </w:rPr>
+        <w:t>所有</w:t>
+      </w:r>
+      <w:r>
+        <w:rPr>
+          <w:rFonts w:hint="eastAsia"/>
+        </w:rPr>
+        <w:t>的</w:t>
+      </w:r>
+      <w:r>
+        <w:rPr>
+          <w:rFonts w:hint="eastAsia"/>
+        </w:rPr>
+        <w:t>位置一起</w:t>
+      </w:r>
+      <w:r>
+        <w:rPr>
+          <w:rFonts w:hint="eastAsia"/>
+        </w:rPr>
+        <w:t>并行计</w:t>
+      </w:r>
+      <w:r>
+        <w:rPr>
+          <w:rFonts w:hint="eastAsia"/>
+        </w:rPr>
+        <w:t>算，怎么知道顺序？</w:t>
+      </w:r>
+      <w:r>
+        <w:rPr>
+          <w:rFonts w:hint="eastAsia"/>
+        </w:rPr>
+        <w:t>比如怎么避免“我吃苹果”和“苹果吃我”没有办法区分的困境呢？</w:t>
+      </w:r>
+      <w:r>
+        <w:rPr>
+          <w:rFonts w:hint="eastAsia"/>
+        </w:rPr>
+        <w:t>Transformer</w:t>
+      </w:r>
+      <w:r>
+        <w:rPr>
+          <w:rFonts w:hint="eastAsia"/>
+        </w:rPr>
+        <w:t>的办法非常巧妙：它会给每个词加一个座位号，比如“我吃苹果”这个短语，它会给“我”“吃”“苹果”每个词一个</w:t>
+      </w:r>
+      <w:r>
+        <w:rPr>
+          <w:rFonts w:hint="eastAsia"/>
+          <w:color w:val="EE0000"/>
+        </w:rPr>
+        <w:t>位置编码</w:t>
+      </w:r>
+      <w:r>
+        <w:rPr>
+          <w:rFonts w:hint="eastAsia"/>
+        </w:rPr>
+        <w:t>，最后，模型会把词的语义信息</w:t>
+      </w:r>
+      <w:r>
+        <w:rPr>
+          <w:rFonts w:hint="eastAsia"/>
+        </w:rPr>
+        <w:t>和位置编码打包，一起输入到网络里去训练</w:t>
+      </w:r>
+      <w:r>
+        <w:rPr>
+          <w:rFonts w:hint="eastAsia"/>
+        </w:rPr>
+        <w:t>。</w:t>
+      </w:r>
+      <w:r>
+        <w:rPr>
+          <w:rFonts w:hint="eastAsia"/>
+        </w:rPr>
+        <w:t>这样机器既能够并行去计算词的关联度，又能够通过位置标签知道是“我”在吃苹果，而不是“苹果在吃我”，位置不能颠倒。</w:t>
+      </w:r>
+    </w:p>
+    <w:p>
+      <w:pPr>
+        <w:jc w:val="center"/>
+        <w:rPr>
+          <w:rFonts w:hint="eastAsia"/>
+        </w:rPr>
+      </w:pPr>
+      <w:r>
+        <w:rPr>
+          <w:noProof/>
+        </w:rPr>
+        <w:drawing>
+          <wp:inline distT="0" distB="0" distL="0" distR="0" wp14:anchorId="3869C0EF" wp14:editId="656826E6">
+            <wp:extent cx="3635655" cy="1727630"/>
+            <wp:effectExtent l="0" t="0" r="3175" b="6350"/>
+            <wp:docPr id="4639767" name="图片 1"/>
+            <wp:cNvGraphicFramePr>
+              <a:graphicFrameLocks xmlns:a="http://schemas.openxmlformats.org/drawingml/2006/main" noChangeAspect="1"/>
+            </wp:cNvGraphicFramePr>
+            <a:graphic xmlns:a="http://schemas.openxmlformats.org/drawingml/2006/main">
+              <a:graphicData uri="http://schemas.openxmlformats.org/drawingml/2006/picture">
+                <pic:pic xmlns:pic="http://schemas.openxmlformats.org/drawingml/2006/picture">
+                  <pic:nvPicPr>
+                    <pic:cNvPr id="4639767" name=""/>
+                    <pic:cNvPicPr/>
+                  </pic:nvPicPr>
+                  <pic:blipFill>
+                    <a:blip r:embed="rId25"/>
+                    <a:stretch>
+                      <a:fillRect/>
+                    </a:stretch>
+                  </pic:blipFill>
+                  <pic:spPr>
+                    <a:xfrm>
+                      <a:off x="0" y="0"/>
+                      <a:ext cx="3652690" cy="1735725"/>
+                    </a:xfrm>
+                    <a:prstGeom prst="rect">
+                      <a:avLst/>
+                    </a:prstGeom>
+                  </pic:spPr>
+                </pic:pic>
+              </a:graphicData>
+            </a:graphic>
+          </wp:inline>
+        </w:drawing>
+      </w:r>
+    </w:p>
+    <w:p>
+      <w:r>
+        <w:tab/>
+      </w:r>
+      <w:r>
+        <w:rPr>
+          <w:rFonts w:hint="eastAsia"/>
+        </w:rPr>
+        <w:t>Transformer</w:t>
+      </w:r>
+      <w:r>
+        <w:rPr>
+          <w:rFonts w:hint="eastAsia"/>
+        </w:rPr>
+        <w:t>通过</w:t>
+      </w:r>
+      <w:r>
+        <w:rPr>
+          <w:rFonts w:hint="eastAsia"/>
+          <w:color w:val="EE0000"/>
+        </w:rPr>
+        <w:t>注意力机制</w:t>
+      </w:r>
+      <w:r>
+        <w:rPr>
+          <w:rFonts w:hint="eastAsia"/>
+        </w:rPr>
+        <w:t>以及</w:t>
+      </w:r>
+      <w:r>
+        <w:rPr>
+          <w:rFonts w:hint="eastAsia"/>
+          <w:color w:val="EE0000"/>
+        </w:rPr>
+        <w:t>位置编码</w:t>
+      </w:r>
+      <w:r>
+        <w:rPr>
+          <w:rFonts w:hint="eastAsia"/>
+        </w:rPr>
+        <w:t>，既实现了对序列中关键信息的精准捕捉，又保留了词语在句子中的位置关系，从而突破了传统模型在长距离依赖处理和并行计算上的局限，为高效理解上下文语义奠定了基础。</w:t>
+      </w:r>
+    </w:p>
+    <w:p>
+      <w:pPr>
+        <w:pStyle w:val="3"/>
+      </w:pPr>
+      <w:r>
+        <w:rPr>
+          <w:rFonts w:hint="eastAsia"/>
+        </w:rPr>
+        <w:t>原理</w:t>
+      </w:r>
+    </w:p>
+    <w:p>
+      <w:r>
+        <w:tab/>
+      </w:r>
+      <w:r>
+        <w:rPr>
+          <w:rFonts w:hint="eastAsia"/>
+        </w:rPr>
+        <w:t>Transformer</w:t>
+      </w:r>
+      <w:r>
+        <w:rPr>
+          <w:rFonts w:hint="eastAsia"/>
+        </w:rPr>
+        <w:t>可以氛围编码器</w:t>
+      </w:r>
+      <w:r>
+        <w:rPr>
+          <w:rFonts w:hint="eastAsia"/>
+        </w:rPr>
+        <w:t>Encoder</w:t>
+      </w:r>
+      <w:r>
+        <w:rPr>
+          <w:rFonts w:hint="eastAsia"/>
+        </w:rPr>
+        <w:t>和解码器</w:t>
+      </w:r>
+      <w:r>
+        <w:rPr>
+          <w:rFonts w:hint="eastAsia"/>
+        </w:rPr>
+        <w:t>Decoder</w:t>
+      </w:r>
+      <w:r>
+        <w:rPr>
+          <w:rFonts w:hint="eastAsia"/>
+        </w:rPr>
+        <w:t>两部分，各自负责不同的任务。现在使用的大模型工具，基本上是沿着其中某一个分支演化的</w:t>
+      </w:r>
+      <w:r>
+        <w:rPr>
+          <w:rFonts w:hint="eastAsia"/>
+        </w:rPr>
+        <w:t>，也有部分少量模型两侧都考虑。</w:t>
       </w:r>
     </w:p>
     <w:p>
@@ -3381,65 +5099,345 @@
         <w:rPr>
           <w:rFonts w:hint="eastAsia"/>
         </w:rPr>
-        <w:t>递归神经网络通常被用于处理序列化的数据，即前一项的输出是用来预测下一项的</w:t>
-      </w:r>
-      <w:r>
-        <w:rPr>
-          <w:rFonts w:hint="eastAsia"/>
-        </w:rPr>
-        <w:t xml:space="preserve"> </w:t>
-      </w:r>
-      <w:r>
-        <w:rPr>
-          <w:rFonts w:hint="eastAsia"/>
-        </w:rPr>
-        <w:t>。</w:t>
+        <w:t>像</w:t>
+      </w:r>
+      <w:r>
+        <w:rPr>
+          <w:rFonts w:hint="eastAsia"/>
+        </w:rPr>
+        <w:t>Bert</w:t>
+      </w:r>
+      <w:r>
+        <w:rPr>
+          <w:rFonts w:hint="eastAsia"/>
+        </w:rPr>
+        <w:t>以后后续的一些变体，主要关注的就是编码器侧的优化，他们不仅在预训练任务的设计上持续迭代，还在模型轻量化的方向上不断突破，使得模型语义理解能力越来越强。</w:t>
       </w:r>
     </w:p>
     <w:p>
       <w:pPr>
         <w:ind w:firstLine="420"/>
-      </w:pPr>
-      <w:r>
-        <w:rPr>
-          <w:rFonts w:hint="eastAsia"/>
-        </w:rPr>
-        <w:t>递归神经网络中存在环的结构，这些神经元上的环状结构使得它们能够存储之前的数据一段时间，从而使得能够预测输出。</w:t>
-      </w:r>
-    </w:p>
-    <w:p>
-      <w:pPr>
-        <w:ind w:firstLine="420"/>
-      </w:pPr>
-      <w:r>
-        <w:rPr>
-          <w:rFonts w:hint="eastAsia"/>
-        </w:rPr>
-        <w:t>与递归神经元相似，在</w:t>
-      </w:r>
-      <w:r>
-        <w:rPr>
-          <w:rFonts w:hint="eastAsia"/>
-        </w:rPr>
-        <w:t>RNN</w:t>
-      </w:r>
-      <w:r>
-        <w:rPr>
-          <w:rFonts w:hint="eastAsia"/>
-        </w:rPr>
-        <w:t>中隐藏层的输出会作为下一次的输入，如此往复经历</w:t>
-      </w:r>
-      <w:r>
-        <w:rPr>
-          <w:rFonts w:hint="eastAsia"/>
-        </w:rPr>
-        <w:t>t</w:t>
-      </w:r>
-      <w:r>
-        <w:rPr>
-          <w:rFonts w:hint="eastAsia"/>
-        </w:rPr>
-        <w:t>次，再将输出的结果传递到下一层网络中。这样，最终输出的结果会更全面，而且之前训练的信息被保持的时间会更久。</w:t>
+        <w:rPr>
+          <w:rFonts w:hint="eastAsia"/>
+        </w:rPr>
+      </w:pPr>
+      <w:r>
+        <w:rPr>
+          <w:rFonts w:hint="eastAsia"/>
+        </w:rPr>
+        <w:t>而</w:t>
+      </w:r>
+      <w:r>
+        <w:rPr>
+          <w:rFonts w:hint="eastAsia"/>
+        </w:rPr>
+        <w:t>GPT</w:t>
+      </w:r>
+      <w:r>
+        <w:rPr>
+          <w:rFonts w:hint="eastAsia"/>
+        </w:rPr>
+        <w:t>系列主要是选择的解码器系列，它主要突破的是模型的规模，不断优化训练数据的质量，将文本的生成能力达到了出神入化的境界。</w:t>
+      </w:r>
+    </w:p>
+    <w:p>
+      <w:r>
+        <w:tab/>
+      </w:r>
+      <w:r>
+        <w:rPr>
+          <w:rFonts w:hint="eastAsia"/>
+        </w:rPr>
+        <w:t>编码器和解码器在处理文本上的区别是什么？</w:t>
+      </w:r>
+    </w:p>
+    <w:p>
+      <w:r>
+        <w:tab/>
+      </w:r>
+      <w:r>
+        <w:rPr>
+          <w:rFonts w:hint="eastAsia"/>
+        </w:rPr>
+        <w:t>Bert</w:t>
+      </w:r>
+      <w:r>
+        <w:rPr>
+          <w:rFonts w:hint="eastAsia"/>
+        </w:rPr>
+        <w:t>就像一个语言理解大师，</w:t>
+      </w:r>
+      <w:r>
+        <w:rPr>
+          <w:rFonts w:hint="eastAsia"/>
+        </w:rPr>
+        <w:t>只用</w:t>
+      </w:r>
+      <w:r>
+        <w:rPr>
+          <w:rFonts w:hint="eastAsia"/>
+        </w:rPr>
+        <w:t>Transformer</w:t>
+      </w:r>
+      <w:r>
+        <w:rPr>
+          <w:rFonts w:hint="eastAsia"/>
+        </w:rPr>
+        <w:t>的编码器部分</w:t>
+      </w:r>
+      <w:r>
+        <w:rPr>
+          <w:rFonts w:hint="eastAsia"/>
+        </w:rPr>
+        <w:t>，</w:t>
+      </w:r>
+      <w:r>
+        <w:rPr>
+          <w:rFonts w:hint="eastAsia"/>
+        </w:rPr>
+        <w:t>特点就是：在解析文本时可以</w:t>
+      </w:r>
+      <w:r>
+        <w:rPr>
+          <w:rFonts w:hint="eastAsia"/>
+          <w:color w:val="EE0000"/>
+        </w:rPr>
+        <w:t>双向看上下文</w:t>
+      </w:r>
+      <w:r>
+        <w:rPr>
+          <w:rFonts w:hint="eastAsia"/>
+        </w:rPr>
+        <w:t>。比如：他在</w:t>
+      </w:r>
+      <w:r>
+        <w:rPr>
+          <w:rFonts w:hint="eastAsia"/>
+        </w:rPr>
+        <w:t>__</w:t>
+      </w:r>
+      <w:r>
+        <w:rPr>
+          <w:rFonts w:hint="eastAsia"/>
+        </w:rPr>
+        <w:t>吃午饭，那么</w:t>
+      </w:r>
+      <w:r>
+        <w:rPr>
+          <w:rFonts w:hint="eastAsia"/>
+        </w:rPr>
+        <w:t>Bert</w:t>
+      </w:r>
+      <w:r>
+        <w:rPr>
+          <w:rFonts w:hint="eastAsia"/>
+        </w:rPr>
+        <w:t>就会同时看左边有“他在”，右边有“吃午饭”，猜出他可能是在公司或者家里，这就是双向看上</w:t>
+      </w:r>
+      <w:r>
+        <w:rPr>
+          <w:rFonts w:hint="eastAsia"/>
+        </w:rPr>
+        <w:lastRenderedPageBreak/>
+        <w:t>下文的功能。有了这个功能，他在大段文本的理解方面就很强，所以他很擅长文本分类、关键词提取、语义匹配等。</w:t>
+      </w:r>
+    </w:p>
+    <w:p>
+      <w:pPr>
+        <w:rPr>
+          <w:rFonts w:hint="eastAsia"/>
+        </w:rPr>
+      </w:pPr>
+      <w:r>
+        <w:tab/>
+      </w:r>
+      <w:r>
+        <w:rPr>
+          <w:rFonts w:hint="eastAsia"/>
+        </w:rPr>
+        <w:t>GPT</w:t>
+      </w:r>
+      <w:r>
+        <w:rPr>
+          <w:rFonts w:hint="eastAsia"/>
+        </w:rPr>
+        <w:t>主要侧重于解码器侧，它更像一个文本生成大师，特点：单向生成，不能看未来。他用的是</w:t>
+      </w:r>
+      <w:r>
+        <w:rPr>
+          <w:rFonts w:hint="eastAsia"/>
+          <w:color w:val="EE0000"/>
+        </w:rPr>
+        <w:t>单向注意力</w:t>
+      </w:r>
+      <w:r>
+        <w:rPr>
+          <w:rFonts w:hint="eastAsia"/>
+        </w:rPr>
+        <w:t>，也叫</w:t>
+      </w:r>
+      <w:r>
+        <w:rPr>
+          <w:rFonts w:hint="eastAsia"/>
+          <w:color w:val="EE0000"/>
+        </w:rPr>
+        <w:t>因果注意力</w:t>
+      </w:r>
+      <w:r>
+        <w:rPr>
+          <w:rFonts w:hint="eastAsia"/>
+        </w:rPr>
+        <w:t>。当你生成当前词的时候，只能看“前面已经生成的词”，不能提前看“后面还没写的词”。另外一方面，解码器还有</w:t>
+      </w:r>
+      <w:r>
+        <w:rPr>
+          <w:rFonts w:hint="eastAsia"/>
+          <w:color w:val="EE0000"/>
+        </w:rPr>
+        <w:t>掩码机制</w:t>
+      </w:r>
+      <w:r>
+        <w:rPr>
+          <w:rFonts w:hint="eastAsia"/>
+        </w:rPr>
+        <w:t>，用来屏蔽未来词，符合时序的逻辑。</w:t>
+      </w:r>
+      <w:r>
+        <w:rPr>
+          <w:rFonts w:hint="eastAsia"/>
+        </w:rPr>
+        <w:t>当然，</w:t>
+      </w:r>
+      <w:r>
+        <w:rPr>
+          <w:rFonts w:hint="eastAsia"/>
+        </w:rPr>
+        <w:t>Transformer</w:t>
+      </w:r>
+      <w:r>
+        <w:rPr>
+          <w:rFonts w:hint="eastAsia"/>
+        </w:rPr>
+        <w:t>也离不开</w:t>
+      </w:r>
+      <w:r>
+        <w:rPr>
+          <w:rFonts w:hint="eastAsia"/>
+          <w:color w:val="EE0000"/>
+        </w:rPr>
+        <w:t>预训练</w:t>
+      </w:r>
+      <w:r>
+        <w:rPr>
+          <w:rFonts w:hint="eastAsia"/>
+          <w:color w:val="EE0000"/>
+        </w:rPr>
+        <w:t>+</w:t>
+      </w:r>
+      <w:r>
+        <w:rPr>
+          <w:rFonts w:hint="eastAsia"/>
+          <w:color w:val="EE0000"/>
+        </w:rPr>
+        <w:t>微调</w:t>
+      </w:r>
+      <w:r>
+        <w:rPr>
+          <w:rFonts w:hint="eastAsia"/>
+        </w:rPr>
+        <w:t>，在预训练阶段，工程师会用海量的文本数据喂给</w:t>
+      </w:r>
+      <w:r>
+        <w:rPr>
+          <w:rFonts w:hint="eastAsia"/>
+        </w:rPr>
+        <w:t>GPT</w:t>
+      </w:r>
+      <w:r>
+        <w:rPr>
+          <w:rFonts w:hint="eastAsia"/>
+        </w:rPr>
+        <w:t>，主要是学习一般性的词语搭配、语法规则、常规知识，通过训练就可以得到“夏天”经过和“炎热”“空调”“西瓜”一起出现，这个时候</w:t>
+      </w:r>
+      <w:r>
+        <w:rPr>
+          <w:rFonts w:hint="eastAsia"/>
+        </w:rPr>
+        <w:t>GPT</w:t>
+      </w:r>
+      <w:r>
+        <w:rPr>
+          <w:rFonts w:hint="eastAsia"/>
+        </w:rPr>
+        <w:t>就训练出来</w:t>
+      </w:r>
+      <w:r>
+        <w:rPr>
+          <w:rFonts w:hint="eastAsia"/>
+          <w:color w:val="EE0000"/>
+        </w:rPr>
+        <w:t>通用能力</w:t>
+      </w:r>
+      <w:r>
+        <w:rPr>
+          <w:rFonts w:hint="eastAsia"/>
+        </w:rPr>
+        <w:t>，让它能够具备基本的知识储备和文本生成能力。到了微调阶段，主要是针对具体任务给</w:t>
+      </w:r>
+      <w:r>
+        <w:rPr>
+          <w:rFonts w:hint="eastAsia"/>
+        </w:rPr>
+        <w:t>GPT</w:t>
+      </w:r>
+      <w:r>
+        <w:rPr>
+          <w:rFonts w:hint="eastAsia"/>
+        </w:rPr>
+        <w:t>做</w:t>
+      </w:r>
+      <w:r>
+        <w:rPr>
+          <w:rFonts w:hint="eastAsia"/>
+          <w:color w:val="EE0000"/>
+        </w:rPr>
+        <w:t>专项训练</w:t>
+      </w:r>
+      <w:r>
+        <w:rPr>
+          <w:rFonts w:hint="eastAsia"/>
+        </w:rPr>
+        <w:t>，比如想要他编码，就需要用</w:t>
+      </w:r>
+      <w:r>
+        <w:rPr>
+          <w:rFonts w:hint="eastAsia"/>
+        </w:rPr>
+        <w:t>GitHub</w:t>
+      </w:r>
+      <w:r>
+        <w:rPr>
+          <w:rFonts w:hint="eastAsia"/>
+        </w:rPr>
+        <w:t>的开源代码做微调。</w:t>
+      </w:r>
+      <w:r>
+        <w:rPr>
+          <w:rFonts w:hint="eastAsia"/>
+        </w:rPr>
+        <w:t>通过这种方式，</w:t>
+      </w:r>
+      <w:r>
+        <w:rPr>
+          <w:rFonts w:hint="eastAsia"/>
+        </w:rPr>
+        <w:t>GPT</w:t>
+      </w:r>
+      <w:r>
+        <w:rPr>
+          <w:rFonts w:hint="eastAsia"/>
+        </w:rPr>
+        <w:t>就能够快速适配不同的工作场景。</w:t>
       </w:r>
     </w:p>
     <w:p>
@@ -3450,90 +5448,47 @@
         <w:rPr>
           <w:rFonts w:hint="eastAsia"/>
         </w:rPr>
-        <w:t>梯度消失问题</w:t>
-      </w:r>
-    </w:p>
-    <w:p>
-      <w:pPr>
-        <w:ind w:firstLine="420"/>
-      </w:pPr>
-      <w:r>
-        <w:rPr>
-          <w:rFonts w:hint="eastAsia"/>
-        </w:rPr>
-        <w:t>当激活函数的梯度很小时就会发生梯度消失问题。在反向传播的过程中，权</w:t>
-      </w:r>
-      <w:r>
-        <w:rPr>
-          <w:rFonts w:hint="eastAsia"/>
-        </w:rPr>
-        <w:lastRenderedPageBreak/>
-        <w:t>重因子会被多次乘以这些小的梯度，因此会越变越小，随着递归的深入趋于“消失”，使得神经网络失去了长程可靠性。这在递归神经网络中是一个较普遍的问题。</w:t>
+        <w:t>特点</w:t>
+      </w:r>
+    </w:p>
+    <w:p>
+      <w:pPr>
+        <w:pStyle w:val="4"/>
+      </w:pPr>
+      <w:r>
+        <w:rPr>
+          <w:rFonts w:hint="eastAsia"/>
+        </w:rPr>
+        <w:t>优点</w:t>
+      </w:r>
+    </w:p>
+    <w:p>
+      <w:pPr>
+        <w:pStyle w:val="4"/>
+        <w:rPr>
+          <w:rFonts w:hint="eastAsia"/>
+        </w:rPr>
+      </w:pPr>
+      <w:r>
+        <w:rPr>
+          <w:rFonts w:hint="eastAsia"/>
+        </w:rPr>
+        <w:t>缺点</w:t>
       </w:r>
     </w:p>
     <w:p>
       <w:pPr>
         <w:pStyle w:val="3"/>
-      </w:pPr>
-      <w:r>
-        <w:rPr>
-          <w:rFonts w:hint="eastAsia"/>
-        </w:rPr>
-        <w:t>梯度爆炸问题</w:t>
-      </w:r>
-    </w:p>
-    <w:p>
-      <w:pPr>
-        <w:ind w:firstLine="420"/>
-      </w:pPr>
-      <w:r>
-        <w:rPr>
-          <w:rFonts w:hint="eastAsia"/>
-        </w:rPr>
-        <w:t>与梯度消失问题对应，当激活函数的梯度较大时，就会发生梯度爆炸问题。在反向传播的过程中，部分节点的大梯度使得他们的权重变得非常大，从而削弱了其他节点对于结果的影响，这个问题可以通过截断</w:t>
-      </w:r>
-      <w:r>
-        <w:rPr>
-          <w:rFonts w:hint="eastAsia"/>
-        </w:rPr>
-        <w:t>(</w:t>
-      </w:r>
-      <w:r>
-        <w:rPr>
-          <w:rFonts w:hint="eastAsia"/>
-        </w:rPr>
-        <w:t>即设置一个梯度允许的最大值</w:t>
-      </w:r>
-      <w:r>
-        <w:rPr>
-          <w:rFonts w:hint="eastAsia"/>
-        </w:rPr>
-        <w:t>)</w:t>
-      </w:r>
-      <w:r>
-        <w:rPr>
-          <w:rFonts w:hint="eastAsia"/>
-        </w:rPr>
-        <w:t>的方式来有效避免。</w:t>
-      </w:r>
-    </w:p>
-    <w:p>
-      <w:pPr>
-        <w:pStyle w:val="2"/>
-      </w:pPr>
-      <w:r>
-        <w:rPr>
-          <w:rFonts w:hint="eastAsia"/>
-        </w:rPr>
-        <w:t>LSTM</w:t>
-      </w:r>
-    </w:p>
-    <w:p>
-      <w:pPr>
-        <w:rPr>
-          <w:rFonts w:hint="eastAsia"/>
-        </w:rPr>
-      </w:pPr>
+        <w:rPr>
+          <w:rFonts w:hint="eastAsia"/>
+        </w:rPr>
+      </w:pPr>
+      <w:r>
+        <w:rPr>
+          <w:rFonts w:hint="eastAsia"/>
+        </w:rPr>
+        <w:t>算法</w:t>
+      </w:r>
     </w:p>
     <w:sectPr>
       <w:pgSz w:w="11906" w:h="16838"/>
@@ -3543,6 +5498,103 @@
     </w:sectPr>
   </w:body>
 </w:document>
+</file>
+
+<file path=word/numbering.xml><?xml version="1.0" encoding="utf-8"?>
+<w:numbering xmlns:wpc="http://schemas.microsoft.com/office/word/2010/wordprocessingCanvas" xmlns:cx="http://schemas.microsoft.com/office/drawing/2014/chartex" xmlns:cx1="http://schemas.microsoft.com/office/drawing/2015/9/8/chartex" xmlns:cx2="http://schemas.microsoft.com/office/drawing/2015/10/21/chartex" xmlns:cx3="http://schemas.microsoft.com/office/drawing/2016/5/9/chartex" xmlns:cx4="http://schemas.microsoft.com/office/drawing/2016/5/10/chartex" xmlns:cx5="http://schemas.microsoft.com/office/drawing/2016/5/11/chartex" xmlns:cx6="http://schemas.microsoft.com/office/drawing/2016/5/12/chartex" xmlns:cx7="http://schemas.microsoft.com/office/drawing/2016/5/13/chartex" xmlns:cx8="http://schemas.microsoft.com/office/drawing/2016/5/14/chartex" xmlns:mc="http://schemas.openxmlformats.org/markup-compatibility/2006" xmlns:aink="http://schemas.microsoft.com/office/drawing/2016/ink" xmlns:am3d="http://schemas.microsoft.com/office/drawing/2017/model3d" xmlns:o="urn:schemas-microsoft-com:office:office" xmlns:oel="http://schemas.microsoft.com/office/2019/extlst" xmlns:r="http://schemas.openxmlformats.org/officeDocument/2006/relationships" xmlns:m="http://schemas.openxmlformats.org/officeDocument/2006/math" xmlns:v="urn:schemas-microsoft-com:vml" xmlns:wp14="http://schemas.microsoft.com/office/word/2010/wordprocessingDrawing" xmlns:wp="http://schemas.openxmlformats.org/drawingml/2006/wordprocessingDrawing" xmlns:w10="urn:schemas-microsoft-com:office:word" xmlns:w="http://schemas.openxmlformats.org/wordprocessingml/2006/main" xmlns:w14="http://schemas.microsoft.com/office/word/2010/wordml" xmlns:w15="http://schemas.microsoft.com/office/word/2012/wordml" xmlns:w16cex="http://schemas.microsoft.com/office/word/2018/wordml/cex" xmlns:w16cid="http://schemas.microsoft.com/office/word/2016/wordml/cid" xmlns:w16="http://schemas.microsoft.com/office/word/2018/wordml" xmlns:w16du="http://schemas.microsoft.com/office/word/2023/wordml/word16du" xmlns:w16sdtdh="http://schemas.microsoft.com/office/word/2020/wordml/sdtdatahash" xmlns:w16sdtfl="http://schemas.microsoft.com/office/word/2024/wordml/sdtformatlock" xmlns:w16se="http://schemas.microsoft.com/office/word/2015/wordml/symex" xmlns:wpg="http://schemas.microsoft.com/office/word/2010/wordprocessingGroup" xmlns:wpi="http://schemas.microsoft.com/office/word/2010/wordprocessingInk" xmlns:wne="http://schemas.microsoft.com/office/word/2006/wordml" xmlns:wps="http://schemas.microsoft.com/office/word/2010/wordprocessingShape" mc:Ignorable="w14 w15 w16se w16cid w16 w16cex w16sdtdh w16sdtfl w16du wp14">
+  <w:abstractNum w:abstractNumId="0" w15:restartNumberingAfterBreak="0">
+    <w:nsid w:val="2AB9232E"/>
+    <w:multiLevelType w:val="hybridMultilevel"/>
+    <w:tmpl w:val="C964897E"/>
+    <w:lvl w:ilvl="0" w:tplc="DFC40108">
+      <w:start w:val="1"/>
+      <w:numFmt w:val="decimal"/>
+      <w:lvlText w:val="%1、"/>
+      <w:lvlJc w:val="left"/>
+      <w:pPr>
+        <w:ind w:left="780" w:hanging="360"/>
+      </w:pPr>
+      <w:rPr>
+        <w:rFonts w:hint="default"/>
+      </w:rPr>
+    </w:lvl>
+    <w:lvl w:ilvl="1" w:tplc="04090019" w:tentative="1">
+      <w:start w:val="1"/>
+      <w:numFmt w:val="lowerLetter"/>
+      <w:lvlText w:val="%2)"/>
+      <w:lvlJc w:val="left"/>
+      <w:pPr>
+        <w:ind w:left="1300" w:hanging="440"/>
+      </w:pPr>
+    </w:lvl>
+    <w:lvl w:ilvl="2" w:tplc="0409001B" w:tentative="1">
+      <w:start w:val="1"/>
+      <w:numFmt w:val="lowerRoman"/>
+      <w:lvlText w:val="%3."/>
+      <w:lvlJc w:val="right"/>
+      <w:pPr>
+        <w:ind w:left="1740" w:hanging="440"/>
+      </w:pPr>
+    </w:lvl>
+    <w:lvl w:ilvl="3" w:tplc="0409000F" w:tentative="1">
+      <w:start w:val="1"/>
+      <w:numFmt w:val="decimal"/>
+      <w:lvlText w:val="%4."/>
+      <w:lvlJc w:val="left"/>
+      <w:pPr>
+        <w:ind w:left="2180" w:hanging="440"/>
+      </w:pPr>
+    </w:lvl>
+    <w:lvl w:ilvl="4" w:tplc="04090019" w:tentative="1">
+      <w:start w:val="1"/>
+      <w:numFmt w:val="lowerLetter"/>
+      <w:lvlText w:val="%5)"/>
+      <w:lvlJc w:val="left"/>
+      <w:pPr>
+        <w:ind w:left="2620" w:hanging="440"/>
+      </w:pPr>
+    </w:lvl>
+    <w:lvl w:ilvl="5" w:tplc="0409001B" w:tentative="1">
+      <w:start w:val="1"/>
+      <w:numFmt w:val="lowerRoman"/>
+      <w:lvlText w:val="%6."/>
+      <w:lvlJc w:val="right"/>
+      <w:pPr>
+        <w:ind w:left="3060" w:hanging="440"/>
+      </w:pPr>
+    </w:lvl>
+    <w:lvl w:ilvl="6" w:tplc="0409000F" w:tentative="1">
+      <w:start w:val="1"/>
+      <w:numFmt w:val="decimal"/>
+      <w:lvlText w:val="%7."/>
+      <w:lvlJc w:val="left"/>
+      <w:pPr>
+        <w:ind w:left="3500" w:hanging="440"/>
+      </w:pPr>
+    </w:lvl>
+    <w:lvl w:ilvl="7" w:tplc="04090019" w:tentative="1">
+      <w:start w:val="1"/>
+      <w:numFmt w:val="lowerLetter"/>
+      <w:lvlText w:val="%8)"/>
+      <w:lvlJc w:val="left"/>
+      <w:pPr>
+        <w:ind w:left="3940" w:hanging="440"/>
+      </w:pPr>
+    </w:lvl>
+    <w:lvl w:ilvl="8" w:tplc="0409001B" w:tentative="1">
+      <w:start w:val="1"/>
+      <w:numFmt w:val="lowerRoman"/>
+      <w:lvlText w:val="%9."/>
+      <w:lvlJc w:val="right"/>
+      <w:pPr>
+        <w:ind w:left="4380" w:hanging="440"/>
+      </w:pPr>
+    </w:lvl>
+  </w:abstractNum>
+  <w:num w:numId="1" w16cid:durableId="1477605770">
+    <w:abstractNumId w:val="0"/>
+  </w:num>
+</w:numbering>
 </file>
 
 <file path=word/styles.xml><?xml version="1.0" encoding="utf-8"?>
@@ -4277,6 +6329,16 @@
       <w:szCs w:val="24"/>
     </w:rPr>
   </w:style>
+  <w:style w:type="paragraph" w:styleId="a5">
+    <w:name w:val="List Paragraph"/>
+    <w:basedOn w:val="a"/>
+    <w:uiPriority w:val="34"/>
+    <w:qFormat/>
+    <w:rsid w:val="00AF3B8C"/>
+    <w:pPr>
+      <w:ind w:firstLineChars="200" w:firstLine="420"/>
+    </w:pPr>
+  </w:style>
 </w:styles>
 </file>
 

</xml_diff>